<commit_message>
feat: add various custom Odoo modules and automation scripts with supporting documentation, translations, and configuration files
</commit_message>
<xml_diff>
--- a/manual/Accouting_Manual/generated_20260408/docx/3.8_3.8 การจัดการการรับชำระแบบกลุ่มบริษัท.docx
+++ b/manual/Accouting_Manual/generated_20260408/docx/3.8_3.8 การจัดการการรับชำระแบบกลุ่มบริษัท.docx
@@ -2,6 +2,12 @@
 <file path=word/document.xml><?xml version="1.0" encoding="utf-8"?>
 <w:document xmlns:wpc="http://schemas.microsoft.com/office/word/2010/wordprocessingCanvas" xmlns:mo="http://schemas.microsoft.com/office/mac/office/2008/main" xmlns:mc="http://schemas.openxmlformats.org/markup-compatibility/2006" xmlns:mv="urn:schemas-microsoft-com:mac:vml" xmlns:o="urn:schemas-microsoft-com:office:office" xmlns:r="http://schemas.openxmlformats.org/officeDocument/2006/relationships" xmlns:m="http://schemas.openxmlformats.org/officeDocument/2006/math" xmlns:v="urn:schemas-microsoft-com:vml" xmlns:wp14="http://schemas.microsoft.com/office/word/2010/wordprocessingDrawing" xmlns:wp="http://schemas.openxmlformats.org/drawingml/2006/wordprocessingDrawing" xmlns:w10="urn:schemas-microsoft-com:office:word" xmlns:w="http://schemas.openxmlformats.org/wordprocessingml/2006/main" xmlns:w14="http://schemas.microsoft.com/office/word/2010/wordml" xmlns:wpg="http://schemas.microsoft.com/office/word/2010/wordprocessingGroup" xmlns:wpi="http://schemas.microsoft.com/office/word/2010/wordprocessingInk" xmlns:wne="http://schemas.microsoft.com/office/word/2006/wordml" xmlns:wps="http://schemas.microsoft.com/office/word/2010/wordprocessingShape" mc:Ignorable="w14 wp14">
   <w:body>
+    <w:sectPr>
+      <w:pgSz w:w="12240" w:h="15840"/>
+      <w:pgMar w:top="1008" w:right="1152" w:bottom="1008" w:left="1152" w:header="720" w:footer="720" w:gutter="0"/>
+      <w:cols w:space="720"/>
+      <w:docGrid w:linePitch="360"/>
+    </w:sectPr>
     <w:p>
       <w:pPr>
         <w:jc w:val="center"/>
@@ -57,11 +63,7 @@
         <w:pStyle w:val="ListBullet"/>
       </w:pPr>
       <w:r>
-        <w:rPr>
-          <w:rFonts w:ascii="TH Sarabun New" w:hAnsi="TH Sarabun New" w:eastAsia="TH Sarabun New"/>
-          <w:sz w:val="32"/>
-        </w:rPr>
-        <w:t>เพื่อให้ผู้ใช้รู้วิธีค้นหาเอกสารคงค้าง เลือกยอดที่จะรับ และเปิด wizard รับชำระเงินได้ถูกต้อง</w:t>
+        <w:t>เพื่อให้ผู้ใช้รู้วิธีค้นหาเอกสารคงค้าง เลือกยอดที่จะรับ และเปิด หน้าต่าง รับชำระเงินได้ถูกต้อง</w:t>
       </w:r>
     </w:p>
     <w:p>
@@ -92,11 +94,7 @@
         <w:pStyle w:val="ListBullet"/>
       </w:pPr>
       <w:r>
-        <w:rPr>
-          <w:rFonts w:ascii="TH Sarabun New" w:hAnsi="TH Sarabun New" w:eastAsia="TH Sarabun New"/>
-          <w:sz w:val="32"/>
-        </w:rPr>
-        <w:t>เมนูนี้เป็น custom สำหรับงานรับชำระแบบกลุ่มบริษัท โดยผู้ใช้เลือกสมาชิกในกลุ่มก่อน แล้วให้ระบบค้นหาใบแจ้งหนี้ที่ค้างชำระของสมาชิกที่เลือก จากนั้นจึงเปิดหน้ารับชำระมาตรฐานของ Odoo เพื่อสร้างรายการรับเงินจริง.</w:t>
+        <w:t>เมนูนี้เป็น เมนูเสริม สำหรับงานรับชำระแบบกลุ่มบริษัท โดยผู้ใช้เลือกสมาชิกในกลุ่มก่อน แล้วให้ระบบค้นหาใบแจ้งหนี้ที่ค้างชำระของสมาชิกที่เลือก จากนั้นจึงเปิดหน้ารับชำระมาตรฐานของ Odoo เพื่อสร้างรายการรับเงินจริง.</w:t>
       </w:r>
     </w:p>
     <w:p>
@@ -104,45 +102,12 @@
         <w:pStyle w:val="ListBullet"/>
       </w:pPr>
       <w:r>
-        <w:rPr>
-          <w:rFonts w:ascii="TH Sarabun New" w:hAnsi="TH Sarabun New" w:eastAsia="TH Sarabun New"/>
-          <w:sz w:val="32"/>
-        </w:rPr>
-        <w:t>ตัวอย่างใน local UAT มีเอกสาร draft ที่ยังไม่สร้าง payment คือเลขที่ 157 และมีเอกสาร done ที่สร้าง payment แล้วคือเลขที่ 142. ในคู่มือนี้จะใช้งานจากสองตัวอย่างนี้เพื่อให้ user เห็นทั้งก่อนและหลังบันทึกรับชำระ.</w:t>
+        <w:t>ในระบบมีทั้งเอกสารรับชำระแบบกลุ่มบริษัทที่อยู่ระหว่างเตรียมรายการ และเอกสารที่บันทึกรับชำระแล้ว โดยคู่มือนี้จะอธิบายให้ผู้ใช้เห็นทั้งขั้นตอนก่อนสร้าง payment และการตรวจสอบผลหลังสร้าง payment จากข้อมูลจริงในระบบ.</w:t>
       </w:r>
     </w:p>
     <w:p>
       <w:r>
-        <w:rPr>
-          <w:rFonts w:ascii="TH Sarabun New" w:hAnsi="TH Sarabun New" w:eastAsia="TH Sarabun New"/>
-          <w:b/>
-          <w:color w:val="1F4E79"/>
-          <w:sz w:val="36"/>
-        </w:rPr>
-        <w:t>เมนูที่ใช้</w:t>
-      </w:r>
-    </w:p>
-    <w:p>
-      <w:pPr>
-        <w:pStyle w:val="ListBullet"/>
-      </w:pPr>
-      <w:r>
-        <w:rPr>
-          <w:rFonts w:ascii="TH Sarabun New" w:hAnsi="TH Sarabun New" w:eastAsia="TH Sarabun New"/>
-          <w:sz w:val="32"/>
-        </w:rPr>
-        <w:t>Accounting &gt; Customers &gt; รับชำระเงินกลุ่มลูกค้า</w:t>
-      </w:r>
-    </w:p>
-    <w:p>
-      <w:r>
-        <w:rPr>
-          <w:rFonts w:ascii="TH Sarabun New" w:hAnsi="TH Sarabun New" w:eastAsia="TH Sarabun New"/>
-          <w:b/>
-          <w:color w:val="1F4E79"/>
-          <w:sz w:val="36"/>
-        </w:rPr>
-        <w:t>ฟังก์ชันที่ทำได้จริง</w:t>
+        <w:t>สิ่งที่ทำได้ในหน้าจอนี้</w:t>
       </w:r>
     </w:p>
     <w:tbl>
@@ -238,11 +203,7 @@
           </w:tcPr>
           <w:p>
             <w:r>
-              <w:rPr>
-                <w:rFonts w:ascii="TH Sarabun New" w:hAnsi="TH Sarabun New" w:eastAsia="TH Sarabun New"/>
-                <w:sz w:val="28"/>
-              </w:rPr>
-              <w:t>ใช้หลังจากเลือกสมาชิกหรือเปลี่ยน filter</w:t>
+              <w:t>ใช้หลังจากเลือกสมาชิกหรือเปลี่ยน ตัวกรอง</w:t>
             </w:r>
           </w:p>
         </w:tc>
@@ -382,13 +343,126 @@
     </w:tbl>
     <w:p>
       <w:r>
+        <w:t>1. เข้าใช้งานจากหน้าหลัก</w:t>
+      </w:r>
+    </w:p>
+    <w:p>
+      <w:pPr>
+        <w:pStyle w:val="ListBullet"/>
+      </w:pPr>
+      <w:r>
         <w:rPr>
           <w:rFonts w:ascii="TH Sarabun New" w:hAnsi="TH Sarabun New" w:eastAsia="TH Sarabun New"/>
-          <w:b/>
-          <w:color w:val="1F4E79"/>
-          <w:sz w:val="36"/>
+          <w:sz w:val="32"/>
         </w:rPr>
-        <w:t>ขั้นตอนการใช้งาน</w:t>
+        <w:t>Accounting &gt; Customers &gt; รับชำระเงินกลุ่มลูกค้า</w:t>
+      </w:r>
+    </w:p>
+    <w:p>
+      <w:r>
+        <w:rPr>
+          <w:b w:val="0"/>
+        </w:rPr>
+        <w:t>ให้เริ่มจากหน้า Dashboard แล้วกดเข้าโมดูลตามภาพ จากนั้นกดเมนูย่อยตามหมายเลขในภาพเพื่อเข้าสู่หน้าที่ใช้ทำรายการจริง.</w:t>
+      </w:r>
+    </w:p>
+    <w:p>
+      <w:pPr>
+        <w:jc w:val="center"/>
+      </w:pPr>
+      <w:r>
+        <w:drawing>
+          <wp:inline xmlns:a="http://schemas.openxmlformats.org/drawingml/2006/main" xmlns:pic="http://schemas.openxmlformats.org/drawingml/2006/picture">
+            <wp:extent cx="5852160" cy="4389120"/>
+            <wp:docPr id="7" name="Picture 7"/>
+            <wp:cNvGraphicFramePr>
+              <a:graphicFrameLocks noChangeAspect="1"/>
+            </wp:cNvGraphicFramePr>
+            <a:graphic>
+              <a:graphicData uri="http://schemas.openxmlformats.org/drawingml/2006/picture">
+                <pic:pic>
+                  <pic:nvPicPr>
+                    <pic:cNvPr id="0" name="image.png"/>
+                    <pic:cNvPicPr/>
+                  </pic:nvPicPr>
+                  <pic:blipFill>
+                    <a:blip r:embed="rId12"/>
+                    <a:stretch>
+                      <a:fillRect/>
+                    </a:stretch>
+                  </pic:blipFill>
+                  <pic:spPr>
+                    <a:xfrm>
+                      <a:off x="0" y="0"/>
+                      <a:ext cx="5852160" cy="4389120"/>
+                    </a:xfrm>
+                    <a:prstGeom prst="rect"/>
+                  </pic:spPr>
+                </pic:pic>
+              </a:graphicData>
+            </a:graphic>
+          </wp:inline>
+        </w:drawing>
+      </w:r>
+    </w:p>
+    <w:p>
+      <w:pPr>
+        <w:jc w:val="center"/>
+      </w:pPr>
+      <w:r>
+        <w:t>รูป 3.8A.1 หน้า Dashboard สำหรับเข้าโมดูล Accounting</w:t>
+      </w:r>
+    </w:p>
+    <w:p>
+      <w:pPr>
+        <w:jc w:val="center"/>
+      </w:pPr>
+      <w:r>
+        <w:drawing>
+          <wp:inline xmlns:a="http://schemas.openxmlformats.org/drawingml/2006/main" xmlns:pic="http://schemas.openxmlformats.org/drawingml/2006/picture">
+            <wp:extent cx="5852160" cy="4389120"/>
+            <wp:docPr id="8" name="Picture 8"/>
+            <wp:cNvGraphicFramePr>
+              <a:graphicFrameLocks noChangeAspect="1"/>
+            </wp:cNvGraphicFramePr>
+            <a:graphic>
+              <a:graphicData uri="http://schemas.openxmlformats.org/drawingml/2006/picture">
+                <pic:pic>
+                  <pic:nvPicPr>
+                    <pic:cNvPr id="0" name="image.png"/>
+                    <pic:cNvPicPr/>
+                  </pic:nvPicPr>
+                  <pic:blipFill>
+                    <a:blip r:embed="rId13"/>
+                    <a:stretch>
+                      <a:fillRect/>
+                    </a:stretch>
+                  </pic:blipFill>
+                  <pic:spPr>
+                    <a:xfrm>
+                      <a:off x="0" y="0"/>
+                      <a:ext cx="5852160" cy="4389120"/>
+                    </a:xfrm>
+                    <a:prstGeom prst="rect"/>
+                  </pic:spPr>
+                </pic:pic>
+              </a:graphicData>
+            </a:graphic>
+          </wp:inline>
+        </w:drawing>
+      </w:r>
+    </w:p>
+    <w:p>
+      <w:pPr>
+        <w:jc w:val="center"/>
+      </w:pPr>
+      <w:r>
+        <w:t>รูป 3.8A.2 เมนู Accounting &gt; Customers &gt; รับชำระเงินกลุ่มลูกค้า</w:t>
+      </w:r>
+    </w:p>
+    <w:p>
+      <w:r>
+        <w:t>2. ขั้นตอนการทำรายการ</w:t>
       </w:r>
     </w:p>
     <w:p>
@@ -403,20 +477,12 @@
     </w:p>
     <w:p>
       <w:r>
-        <w:rPr>
-          <w:rFonts w:ascii="TH Sarabun New" w:hAnsi="TH Sarabun New" w:eastAsia="TH Sarabun New"/>
-          <w:sz w:val="32"/>
-        </w:rPr>
-        <w:t>1. เข้าเมนู Accounting &gt; Customers &gt; รับชำระเงินกลุ่มลูกค้า แล้วกด New เพื่อสร้างเอกสารใหม่ หรือเปิดเอกสาร draft ตัวอย่างเลขที่ 157 เพื่อดู flow ที่เตรียมไว้.</w:t>
+        <w:t>1. เข้าเมนู Accounting &gt; Customers &gt; รับชำระเงินกลุ่มลูกค้า แล้วกด New เพื่อสร้างเอกสารใหม่ หรือเปิดเอกสารจริงที่ผู้ใช้งานต้องการตรวจสอบเพื่อดูรายการที่ค้างชำระอยู่ในระบบ.</w:t>
       </w:r>
     </w:p>
     <w:p>
       <w:r>
-        <w:rPr>
-          <w:rFonts w:ascii="TH Sarabun New" w:hAnsi="TH Sarabun New" w:eastAsia="TH Sarabun New"/>
-          <w:sz w:val="32"/>
-        </w:rPr>
-        <w:t>2. ในช่อง ลูกค้า/สมาชิกกลุ่ม ให้เลือกคู่ค้าที่อยู่ภายใต้กลุ่มเดียวกัน จากตัวอย่าง local UAT ใช้ UAT Manual Customer A 20260408 และ UAT Manual Customer B 20260408.</w:t>
+        <w:t>2. ในช่อง ลูกค้า/สมาชิกกลุ่ม ให้เลือกคู่ค้าที่อยู่ภายใต้กลุ่มเดียวกันตามข้อมูลจริงของรายการที่ต้องการรับชำระ ระบบจะดึงเอกสารคงค้างของสมาชิกที่เลือกมาแสดงในตาราง.</w:t>
       </w:r>
     </w:p>
     <w:p>
@@ -458,11 +524,7 @@
     </w:p>
     <w:p>
       <w:r>
-        <w:rPr>
-          <w:rFonts w:ascii="TH Sarabun New" w:hAnsi="TH Sarabun New" w:eastAsia="TH Sarabun New"/>
-          <w:sz w:val="32"/>
-        </w:rPr>
-        <w:t>2. ใน wizard ให้เลือก Journal ที่ต้องการรับเงินจริง เช่น Journal รับเงินสดหรือบัญชีพักรับชำระตามนโยบายของบริษัท.</w:t>
+        <w:t>2. ใน หน้าต่าง ให้เลือก Journal ที่ต้องการรับเงินจริง เช่น Journal รับเงินสดหรือบัญชีพักรับชำระตามนโยบายของบริษัท.</w:t>
       </w:r>
     </w:p>
     <w:p>
@@ -485,480 +547,7 @@
     </w:p>
     <w:p>
       <w:r>
-        <w:rPr>
-          <w:rFonts w:ascii="TH Sarabun New" w:hAnsi="TH Sarabun New" w:eastAsia="TH Sarabun New"/>
-          <w:b/>
-          <w:color w:val="1F4E79"/>
-          <w:sz w:val="36"/>
-        </w:rPr>
-        <w:t>ภาพประกอบการทำงาน</w:t>
-      </w:r>
-    </w:p>
-    <w:p>
-      <w:pPr>
-        <w:jc w:val="center"/>
-      </w:pPr>
-      <w:r>
-        <w:drawing>
-          <wp:inline xmlns:a="http://schemas.openxmlformats.org/drawingml/2006/main" xmlns:pic="http://schemas.openxmlformats.org/drawingml/2006/picture">
-            <wp:extent cx="6035040" cy="4526280"/>
-            <wp:docPr id="1" name="Picture 1"/>
-            <wp:cNvGraphicFramePr>
-              <a:graphicFrameLocks noChangeAspect="1"/>
-            </wp:cNvGraphicFramePr>
-            <a:graphic>
-              <a:graphicData uri="http://schemas.openxmlformats.org/drawingml/2006/picture">
-                <pic:pic>
-                  <pic:nvPicPr>
-                    <pic:cNvPr id="0" name="group_draft_manual_annotated.png"/>
-                    <pic:cNvPicPr/>
-                  </pic:nvPicPr>
-                  <pic:blipFill>
-                    <a:blip r:embed="rId9"/>
-                    <a:stretch>
-                      <a:fillRect/>
-                    </a:stretch>
-                  </pic:blipFill>
-                  <pic:spPr>
-                    <a:xfrm>
-                      <a:off x="0" y="0"/>
-                      <a:ext cx="6035040" cy="4526280"/>
-                    </a:xfrm>
-                    <a:prstGeom prst="rect"/>
-                  </pic:spPr>
-                </pic:pic>
-              </a:graphicData>
-            </a:graphic>
-          </wp:inline>
-        </w:drawing>
-      </w:r>
-    </w:p>
-    <w:p>
-      <w:pPr>
-        <w:jc w:val="center"/>
-      </w:pPr>
-      <w:r>
-        <w:rPr>
-          <w:rFonts w:ascii="TH Sarabun New" w:hAnsi="TH Sarabun New" w:eastAsia="TH Sarabun New"/>
-          <w:i/>
-          <w:sz w:val="28"/>
-        </w:rPr>
-        <w:t>รูป 3.8.1 หน้าจอ Group Payment สถานะ Draft พร้อมจุดที่ต้องคลิกก่อนค้นหาเอกสาร</w:t>
-      </w:r>
-    </w:p>
-    <w:p>
-      <w:pPr>
-        <w:jc w:val="center"/>
-      </w:pPr>
-      <w:r>
-        <w:drawing>
-          <wp:inline xmlns:a="http://schemas.openxmlformats.org/drawingml/2006/main" xmlns:pic="http://schemas.openxmlformats.org/drawingml/2006/picture">
-            <wp:extent cx="6035040" cy="4526280"/>
-            <wp:docPr id="2" name="Picture 2"/>
-            <wp:cNvGraphicFramePr>
-              <a:graphicFrameLocks noChangeAspect="1"/>
-            </wp:cNvGraphicFramePr>
-            <a:graphic>
-              <a:graphicData uri="http://schemas.openxmlformats.org/drawingml/2006/picture">
-                <pic:pic>
-                  <pic:nvPicPr>
-                    <pic:cNvPr id="0" name="group_payment_wizard_manual_annotated.png"/>
-                    <pic:cNvPicPr/>
-                  </pic:nvPicPr>
-                  <pic:blipFill>
-                    <a:blip r:embed="rId10"/>
-                    <a:stretch>
-                      <a:fillRect/>
-                    </a:stretch>
-                  </pic:blipFill>
-                  <pic:spPr>
-                    <a:xfrm>
-                      <a:off x="0" y="0"/>
-                      <a:ext cx="6035040" cy="4526280"/>
-                    </a:xfrm>
-                    <a:prstGeom prst="rect"/>
-                  </pic:spPr>
-                </pic:pic>
-              </a:graphicData>
-            </a:graphic>
-          </wp:inline>
-        </w:drawing>
-      </w:r>
-    </w:p>
-    <w:p>
-      <w:pPr>
-        <w:jc w:val="center"/>
-      </w:pPr>
-      <w:r>
-        <w:rPr>
-          <w:rFonts w:ascii="TH Sarabun New" w:hAnsi="TH Sarabun New" w:eastAsia="TH Sarabun New"/>
-          <w:i/>
-          <w:sz w:val="28"/>
-        </w:rPr>
-        <w:t>รูป 3.8.2 หน้าต่าง Payment Register ที่เปิดจากปุ่ม ดำเนินการรับชำระ</w:t>
-      </w:r>
-    </w:p>
-    <w:p>
-      <w:pPr>
-        <w:jc w:val="center"/>
-      </w:pPr>
-      <w:r>
-        <w:drawing>
-          <wp:inline xmlns:a="http://schemas.openxmlformats.org/drawingml/2006/main" xmlns:pic="http://schemas.openxmlformats.org/drawingml/2006/picture">
-            <wp:extent cx="6035040" cy="4526280"/>
-            <wp:docPr id="3" name="Picture 3"/>
-            <wp:cNvGraphicFramePr>
-              <a:graphicFrameLocks noChangeAspect="1"/>
-            </wp:cNvGraphicFramePr>
-            <a:graphic>
-              <a:graphicData uri="http://schemas.openxmlformats.org/drawingml/2006/picture">
-                <pic:pic>
-                  <pic:nvPicPr>
-                    <pic:cNvPr id="0" name="group_done_manual_annotated.png"/>
-                    <pic:cNvPicPr/>
-                  </pic:nvPicPr>
-                  <pic:blipFill>
-                    <a:blip r:embed="rId11"/>
-                    <a:stretch>
-                      <a:fillRect/>
-                    </a:stretch>
-                  </pic:blipFill>
-                  <pic:spPr>
-                    <a:xfrm>
-                      <a:off x="0" y="0"/>
-                      <a:ext cx="6035040" cy="4526280"/>
-                    </a:xfrm>
-                    <a:prstGeom prst="rect"/>
-                  </pic:spPr>
-                </pic:pic>
-              </a:graphicData>
-            </a:graphic>
-          </wp:inline>
-        </w:drawing>
-      </w:r>
-    </w:p>
-    <w:p>
-      <w:pPr>
-        <w:jc w:val="center"/>
-      </w:pPr>
-      <w:r>
-        <w:rPr>
-          <w:rFonts w:ascii="TH Sarabun New" w:hAnsi="TH Sarabun New" w:eastAsia="TH Sarabun New"/>
-          <w:i/>
-          <w:sz w:val="28"/>
-        </w:rPr>
-        <w:t>รูป 3.8.3 หน้าจอ Group Payment สถานะ Done หลังสร้าง payment แล้ว</w:t>
-      </w:r>
-    </w:p>
-    <w:p>
-      <w:r>
-        <w:rPr>
-          <w:rFonts w:ascii="TH Sarabun New" w:hAnsi="TH Sarabun New" w:eastAsia="TH Sarabun New"/>
-          <w:b/>
-          <w:color w:val="1F4E79"/>
-          <w:sz w:val="36"/>
-        </w:rPr>
-        <w:t>คำอธิบายฟิลด์และส่วนสำคัญบนหน้าจอ</w:t>
-      </w:r>
-    </w:p>
-    <w:p>
-      <w:r>
-        <w:rPr>
-          <w:rFonts w:ascii="TH Sarabun New" w:hAnsi="TH Sarabun New" w:eastAsia="TH Sarabun New"/>
-          <w:b/>
-          <w:sz w:val="32"/>
-        </w:rPr>
-        <w:t>ตารางอธิบายฟิลด์สำคัญของหน้าจอ Group Payment</w:t>
-      </w:r>
-    </w:p>
-    <w:tbl>
-      <w:tblPr>
-        <w:tblStyle w:val="TableGrid"/>
-        <w:tblW w:type="auto" w:w="0"/>
-        <w:tblLook w:firstColumn="1" w:firstRow="1" w:lastColumn="0" w:lastRow="0" w:noHBand="0" w:noVBand="1" w:val="04A0"/>
-      </w:tblPr>
-      <w:tblGrid>
-        <w:gridCol w:w="3312"/>
-        <w:gridCol w:w="3312"/>
-        <w:gridCol w:w="3312"/>
-      </w:tblGrid>
-      <w:tr>
-        <w:tc>
-          <w:tcPr>
-            <w:tcW w:type="dxa" w:w="3312"/>
-            <w:shd w:fill="D9EAF7"/>
-          </w:tcPr>
-          <w:p>
-            <w:r>
-              <w:rPr>
-                <w:rFonts w:ascii="TH Sarabun New" w:hAnsi="TH Sarabun New" w:eastAsia="TH Sarabun New"/>
-                <w:sz w:val="28"/>
-              </w:rPr>
-              <w:t>Field / Section</w:t>
-            </w:r>
-          </w:p>
-        </w:tc>
-        <w:tc>
-          <w:tcPr>
-            <w:tcW w:type="dxa" w:w="3312"/>
-            <w:shd w:fill="D9EAF7"/>
-          </w:tcPr>
-          <w:p>
-            <w:r>
-              <w:rPr>
-                <w:rFonts w:ascii="TH Sarabun New" w:hAnsi="TH Sarabun New" w:eastAsia="TH Sarabun New"/>
-                <w:sz w:val="28"/>
-              </w:rPr>
-              <w:t>ความหมาย</w:t>
-            </w:r>
-          </w:p>
-        </w:tc>
-        <w:tc>
-          <w:tcPr>
-            <w:tcW w:type="dxa" w:w="3312"/>
-            <w:shd w:fill="D9EAF7"/>
-          </w:tcPr>
-          <w:p>
-            <w:r>
-              <w:rPr>
-                <w:rFonts w:ascii="TH Sarabun New" w:hAnsi="TH Sarabun New" w:eastAsia="TH Sarabun New"/>
-                <w:sz w:val="28"/>
-              </w:rPr>
-              <w:t>วิธีใช้หรือค่าตัวอย่าง</w:t>
-            </w:r>
-          </w:p>
-        </w:tc>
-      </w:tr>
-      <w:tr>
-        <w:tc>
-          <w:tcPr>
-            <w:tcW w:type="dxa" w:w="3312"/>
-          </w:tcPr>
-          <w:p>
-            <w:r>
-              <w:rPr>
-                <w:rFonts w:ascii="TH Sarabun New" w:hAnsi="TH Sarabun New" w:eastAsia="TH Sarabun New"/>
-                <w:sz w:val="28"/>
-              </w:rPr>
-              <w:t>member_partner_ids</w:t>
-            </w:r>
-          </w:p>
-        </w:tc>
-        <w:tc>
-          <w:tcPr>
-            <w:tcW w:type="dxa" w:w="3312"/>
-          </w:tcPr>
-          <w:p>
-            <w:r>
-              <w:rPr>
-                <w:rFonts w:ascii="TH Sarabun New" w:hAnsi="TH Sarabun New" w:eastAsia="TH Sarabun New"/>
-                <w:sz w:val="28"/>
-              </w:rPr>
-              <w:t>รายชื่อคู่ค้าภายใต้กลุ่มบริษัทที่ต้องการดึงเอกสารคงค้าง</w:t>
-            </w:r>
-          </w:p>
-        </w:tc>
-        <w:tc>
-          <w:tcPr>
-            <w:tcW w:type="dxa" w:w="3312"/>
-          </w:tcPr>
-          <w:p>
-            <w:r>
-              <w:rPr>
-                <w:rFonts w:ascii="TH Sarabun New" w:hAnsi="TH Sarabun New" w:eastAsia="TH Sarabun New"/>
-                <w:sz w:val="28"/>
-              </w:rPr>
-              <w:t>เลือกคู่ค้าที่อยู่ในกลุ่มเดียวกันเท่านั้น</w:t>
-            </w:r>
-          </w:p>
-        </w:tc>
-      </w:tr>
-      <w:tr>
-        <w:tc>
-          <w:tcPr>
-            <w:tcW w:type="dxa" w:w="3312"/>
-          </w:tcPr>
-          <w:p>
-            <w:r>
-              <w:rPr>
-                <w:rFonts w:ascii="TH Sarabun New" w:hAnsi="TH Sarabun New" w:eastAsia="TH Sarabun New"/>
-                <w:sz w:val="28"/>
-              </w:rPr>
-              <w:t>summary_info</w:t>
-            </w:r>
-          </w:p>
-        </w:tc>
-        <w:tc>
-          <w:tcPr>
-            <w:tcW w:type="dxa" w:w="3312"/>
-          </w:tcPr>
-          <w:p>
-            <w:r>
-              <w:rPr>
-                <w:rFonts w:ascii="TH Sarabun New" w:hAnsi="TH Sarabun New" w:eastAsia="TH Sarabun New"/>
-                <w:sz w:val="28"/>
-              </w:rPr>
-              <w:t>สรุปยอดคงค้างรวมของคู่ค้าที่เลือก</w:t>
-            </w:r>
-          </w:p>
-        </w:tc>
-        <w:tc>
-          <w:tcPr>
-            <w:tcW w:type="dxa" w:w="3312"/>
-          </w:tcPr>
-          <w:p>
-            <w:r>
-              <w:rPr>
-                <w:rFonts w:ascii="TH Sarabun New" w:hAnsi="TH Sarabun New" w:eastAsia="TH Sarabun New"/>
-                <w:sz w:val="28"/>
-              </w:rPr>
-              <w:t>ใช้เช็กก่อนเลือกเอกสาร</w:t>
-            </w:r>
-          </w:p>
-        </w:tc>
-      </w:tr>
-      <w:tr>
-        <w:tc>
-          <w:tcPr>
-            <w:tcW w:type="dxa" w:w="3312"/>
-          </w:tcPr>
-          <w:p>
-            <w:r>
-              <w:rPr>
-                <w:rFonts w:ascii="TH Sarabun New" w:hAnsi="TH Sarabun New" w:eastAsia="TH Sarabun New"/>
-                <w:sz w:val="28"/>
-              </w:rPr>
-              <w:t>filter_date_from / filter_date_to</w:t>
-            </w:r>
-          </w:p>
-        </w:tc>
-        <w:tc>
-          <w:tcPr>
-            <w:tcW w:type="dxa" w:w="3312"/>
-          </w:tcPr>
-          <w:p>
-            <w:r>
-              <w:rPr>
-                <w:rFonts w:ascii="TH Sarabun New" w:hAnsi="TH Sarabun New" w:eastAsia="TH Sarabun New"/>
-                <w:sz w:val="28"/>
-              </w:rPr>
-              <w:t>กรองช่วงวันที่เอกสารที่จะดึงเข้ามา</w:t>
-            </w:r>
-          </w:p>
-        </w:tc>
-        <w:tc>
-          <w:tcPr>
-            <w:tcW w:type="dxa" w:w="3312"/>
-          </w:tcPr>
-          <w:p>
-            <w:r>
-              <w:rPr>
-                <w:rFonts w:ascii="TH Sarabun New" w:hAnsi="TH Sarabun New" w:eastAsia="TH Sarabun New"/>
-                <w:sz w:val="28"/>
-              </w:rPr>
-              <w:t>ช่วยตัดรายการเก่าหรืออนาคตออก</w:t>
-            </w:r>
-          </w:p>
-        </w:tc>
-      </w:tr>
-      <w:tr>
-        <w:tc>
-          <w:tcPr>
-            <w:tcW w:type="dxa" w:w="3312"/>
-          </w:tcPr>
-          <w:p>
-            <w:r>
-              <w:rPr>
-                <w:rFonts w:ascii="TH Sarabun New" w:hAnsi="TH Sarabun New" w:eastAsia="TH Sarabun New"/>
-                <w:sz w:val="28"/>
-              </w:rPr>
-              <w:t>filter_min_amount</w:t>
-            </w:r>
-          </w:p>
-        </w:tc>
-        <w:tc>
-          <w:tcPr>
-            <w:tcW w:type="dxa" w:w="3312"/>
-          </w:tcPr>
-          <w:p>
-            <w:r>
-              <w:rPr>
-                <w:rFonts w:ascii="TH Sarabun New" w:hAnsi="TH Sarabun New" w:eastAsia="TH Sarabun New"/>
-                <w:sz w:val="28"/>
-              </w:rPr>
-              <w:t>กรองรายการที่ยอดค้างต่ำกว่าเกณฑ์</w:t>
-            </w:r>
-          </w:p>
-        </w:tc>
-        <w:tc>
-          <w:tcPr>
-            <w:tcW w:type="dxa" w:w="3312"/>
-          </w:tcPr>
-          <w:p>
-            <w:r>
-              <w:rPr>
-                <w:rFonts w:ascii="TH Sarabun New" w:hAnsi="TH Sarabun New" w:eastAsia="TH Sarabun New"/>
-                <w:sz w:val="28"/>
-              </w:rPr>
-              <w:t>ช่วยลดรายการย่อยที่ไม่ต้องการรับชำระ</w:t>
-            </w:r>
-          </w:p>
-        </w:tc>
-      </w:tr>
-      <w:tr>
-        <w:tc>
-          <w:tcPr>
-            <w:tcW w:type="dxa" w:w="3312"/>
-          </w:tcPr>
-          <w:p>
-            <w:r>
-              <w:rPr>
-                <w:rFonts w:ascii="TH Sarabun New" w:hAnsi="TH Sarabun New" w:eastAsia="TH Sarabun New"/>
-                <w:sz w:val="28"/>
-              </w:rPr>
-              <w:t>line_ids</w:t>
-            </w:r>
-          </w:p>
-        </w:tc>
-        <w:tc>
-          <w:tcPr>
-            <w:tcW w:type="dxa" w:w="3312"/>
-          </w:tcPr>
-          <w:p>
-            <w:r>
-              <w:rPr>
-                <w:rFonts w:ascii="TH Sarabun New" w:hAnsi="TH Sarabun New" w:eastAsia="TH Sarabun New"/>
-                <w:sz w:val="28"/>
-              </w:rPr>
-              <w:t>ตารางเอกสารที่พบ พร้อมยอดรวม ยอดค้าง และยอดที่จะรับชำระ</w:t>
-            </w:r>
-          </w:p>
-        </w:tc>
-        <w:tc>
-          <w:tcPr>
-            <w:tcW w:type="dxa" w:w="3312"/>
-          </w:tcPr>
-          <w:p>
-            <w:r>
-              <w:rPr>
-                <w:rFonts w:ascii="TH Sarabun New" w:hAnsi="TH Sarabun New" w:eastAsia="TH Sarabun New"/>
-                <w:sz w:val="28"/>
-              </w:rPr>
-              <w:t>ช่อง is_selected ใช้เลือกเอกสารที่จะรับจริง</w:t>
-            </w:r>
-          </w:p>
-        </w:tc>
-      </w:tr>
-    </w:tbl>
-    <w:p>
-      <w:r>
-        <w:rPr>
-          <w:rFonts w:ascii="TH Sarabun New" w:hAnsi="TH Sarabun New" w:eastAsia="TH Sarabun New"/>
-          <w:b/>
-          <w:color w:val="1F4E79"/>
-          <w:sz w:val="36"/>
-        </w:rPr>
-        <w:t>Scenario การใช้งานจากข้อมูลจริงใน local UAT</w:t>
+        <w:t>ตัวอย่างข้อมูลจริงที่ใช้ในคู่มือ</w:t>
       </w:r>
     </w:p>
     <w:tbl>
@@ -1110,13 +699,7 @@
     </w:tbl>
     <w:p>
       <w:r>
-        <w:rPr>
-          <w:rFonts w:ascii="TH Sarabun New" w:hAnsi="TH Sarabun New" w:eastAsia="TH Sarabun New"/>
-          <w:b/>
-          <w:color w:val="1F4E79"/>
-          <w:sz w:val="36"/>
-        </w:rPr>
-        <w:t>การอธิบาย Journal Items และขาบัญชี</w:t>
+        <w:t>3. ตรวจสอบรายการบัญชี (Journal Entry)</w:t>
       </w:r>
     </w:p>
     <w:p>
@@ -1323,12 +906,347 @@
     <w:p>
       <w:r>
         <w:rPr>
+          <w:b w:val="0"/>
+        </w:rPr>
+        <w:t>หลังบันทึกรายการสำเร็จ ให้เปิด Journal Entry เพื่อตรวจดูว่าระบบบันทึกเงินเข้า เงินออก หรือบัญชีพักไว้ที่บัญชีใดบ้างตามตัวอย่างจริงด้านล่าง.</w:t>
+      </w:r>
+    </w:p>
+    <w:p>
+      <w:pPr>
+        <w:jc w:val="center"/>
+      </w:pPr>
+      <w:r>
+        <w:drawing>
+          <wp:inline xmlns:a="http://schemas.openxmlformats.org/drawingml/2006/main" xmlns:pic="http://schemas.openxmlformats.org/drawingml/2006/picture">
+            <wp:extent cx="5852160" cy="4389120"/>
+            <wp:docPr id="9" name="Picture 9"/>
+            <wp:cNvGraphicFramePr>
+              <a:graphicFrameLocks noChangeAspect="1"/>
+            </wp:cNvGraphicFramePr>
+            <a:graphic>
+              <a:graphicData uri="http://schemas.openxmlformats.org/drawingml/2006/picture">
+                <pic:pic>
+                  <pic:nvPicPr>
+                    <pic:cNvPr id="0" name="image.png"/>
+                    <pic:cNvPicPr/>
+                  </pic:nvPicPr>
+                  <pic:blipFill>
+                    <a:blip r:embed="rId14"/>
+                    <a:stretch>
+                      <a:fillRect/>
+                    </a:stretch>
+                  </pic:blipFill>
+                  <pic:spPr>
+                    <a:xfrm>
+                      <a:off x="0" y="0"/>
+                      <a:ext cx="5852160" cy="4389120"/>
+                    </a:xfrm>
+                    <a:prstGeom prst="rect"/>
+                  </pic:spPr>
+                </pic:pic>
+              </a:graphicData>
+            </a:graphic>
+          </wp:inline>
+        </w:drawing>
+      </w:r>
+    </w:p>
+    <w:p>
+      <w:pPr>
+        <w:jc w:val="center"/>
+      </w:pPr>
+      <w:r>
+        <w:t>รูป 3.8A.3 Journal Entry ของการรับชำระแบบกลุ่มบริษัทจากข้อมูลจริงในระบบ</w:t>
+      </w:r>
+    </w:p>
+    <w:p>
+      <w:r>
+        <w:t>คำอธิบายช่องสำคัญบนหน้าจอ</w:t>
+      </w:r>
+    </w:p>
+    <w:p>
+      <w:r>
+        <w:rPr>
           <w:rFonts w:ascii="TH Sarabun New" w:hAnsi="TH Sarabun New" w:eastAsia="TH Sarabun New"/>
           <w:b/>
-          <w:color w:val="1F4E79"/>
-          <w:sz w:val="36"/>
+          <w:sz w:val="32"/>
         </w:rPr>
-        <w:t>ข้อควรระวัง</w:t>
+        <w:t>ตารางอธิบายฟิลด์สำคัญของหน้าจอ Group Payment</w:t>
+      </w:r>
+    </w:p>
+    <w:tbl>
+      <w:tblPr>
+        <w:tblStyle w:val="TableGrid"/>
+        <w:tblW w:type="auto" w:w="0"/>
+        <w:tblLook w:firstColumn="1" w:firstRow="1" w:lastColumn="0" w:lastRow="0" w:noHBand="0" w:noVBand="1" w:val="04A0"/>
+      </w:tblPr>
+      <w:tblGrid>
+        <w:gridCol w:w="3312"/>
+        <w:gridCol w:w="3312"/>
+        <w:gridCol w:w="3312"/>
+      </w:tblGrid>
+      <w:tr>
+        <w:tc>
+          <w:tcPr>
+            <w:tcW w:type="dxa" w:w="3312"/>
+            <w:shd w:fill="D9EAF7"/>
+          </w:tcPr>
+          <w:p>
+            <w:r>
+              <w:rPr>
+                <w:rFonts w:ascii="TH Sarabun New" w:hAnsi="TH Sarabun New" w:eastAsia="TH Sarabun New"/>
+                <w:sz w:val="28"/>
+              </w:rPr>
+              <w:t>Field / Section</w:t>
+            </w:r>
+          </w:p>
+        </w:tc>
+        <w:tc>
+          <w:tcPr>
+            <w:tcW w:type="dxa" w:w="3312"/>
+            <w:shd w:fill="D9EAF7"/>
+          </w:tcPr>
+          <w:p>
+            <w:r>
+              <w:rPr>
+                <w:rFonts w:ascii="TH Sarabun New" w:hAnsi="TH Sarabun New" w:eastAsia="TH Sarabun New"/>
+                <w:sz w:val="28"/>
+              </w:rPr>
+              <w:t>ความหมาย</w:t>
+            </w:r>
+          </w:p>
+        </w:tc>
+        <w:tc>
+          <w:tcPr>
+            <w:tcW w:type="dxa" w:w="3312"/>
+            <w:shd w:fill="D9EAF7"/>
+          </w:tcPr>
+          <w:p>
+            <w:r>
+              <w:rPr>
+                <w:rFonts w:ascii="TH Sarabun New" w:hAnsi="TH Sarabun New" w:eastAsia="TH Sarabun New"/>
+                <w:sz w:val="28"/>
+              </w:rPr>
+              <w:t>วิธีใช้หรือค่าตัวอย่าง</w:t>
+            </w:r>
+          </w:p>
+        </w:tc>
+      </w:tr>
+      <w:tr>
+        <w:tc>
+          <w:tcPr>
+            <w:tcW w:type="dxa" w:w="3312"/>
+          </w:tcPr>
+          <w:p>
+            <w:r>
+              <w:rPr>
+                <w:rFonts w:ascii="TH Sarabun New" w:hAnsi="TH Sarabun New" w:eastAsia="TH Sarabun New"/>
+                <w:sz w:val="28"/>
+              </w:rPr>
+              <w:t>member_partner_ids</w:t>
+            </w:r>
+          </w:p>
+        </w:tc>
+        <w:tc>
+          <w:tcPr>
+            <w:tcW w:type="dxa" w:w="3312"/>
+          </w:tcPr>
+          <w:p>
+            <w:r>
+              <w:rPr>
+                <w:rFonts w:ascii="TH Sarabun New" w:hAnsi="TH Sarabun New" w:eastAsia="TH Sarabun New"/>
+                <w:sz w:val="28"/>
+              </w:rPr>
+              <w:t>รายชื่อคู่ค้าภายใต้กลุ่มบริษัทที่ต้องการดึงเอกสารคงค้าง</w:t>
+            </w:r>
+          </w:p>
+        </w:tc>
+        <w:tc>
+          <w:tcPr>
+            <w:tcW w:type="dxa" w:w="3312"/>
+          </w:tcPr>
+          <w:p>
+            <w:r>
+              <w:rPr>
+                <w:rFonts w:ascii="TH Sarabun New" w:hAnsi="TH Sarabun New" w:eastAsia="TH Sarabun New"/>
+                <w:sz w:val="28"/>
+              </w:rPr>
+              <w:t>เลือกคู่ค้าที่อยู่ในกลุ่มเดียวกันเท่านั้น</w:t>
+            </w:r>
+          </w:p>
+        </w:tc>
+      </w:tr>
+      <w:tr>
+        <w:tc>
+          <w:tcPr>
+            <w:tcW w:type="dxa" w:w="3312"/>
+          </w:tcPr>
+          <w:p>
+            <w:r>
+              <w:rPr>
+                <w:rFonts w:ascii="TH Sarabun New" w:hAnsi="TH Sarabun New" w:eastAsia="TH Sarabun New"/>
+                <w:sz w:val="28"/>
+              </w:rPr>
+              <w:t>summary_info</w:t>
+            </w:r>
+          </w:p>
+        </w:tc>
+        <w:tc>
+          <w:tcPr>
+            <w:tcW w:type="dxa" w:w="3312"/>
+          </w:tcPr>
+          <w:p>
+            <w:r>
+              <w:rPr>
+                <w:rFonts w:ascii="TH Sarabun New" w:hAnsi="TH Sarabun New" w:eastAsia="TH Sarabun New"/>
+                <w:sz w:val="28"/>
+              </w:rPr>
+              <w:t>สรุปยอดคงค้างรวมของคู่ค้าที่เลือก</w:t>
+            </w:r>
+          </w:p>
+        </w:tc>
+        <w:tc>
+          <w:tcPr>
+            <w:tcW w:type="dxa" w:w="3312"/>
+          </w:tcPr>
+          <w:p>
+            <w:r>
+              <w:rPr>
+                <w:rFonts w:ascii="TH Sarabun New" w:hAnsi="TH Sarabun New" w:eastAsia="TH Sarabun New"/>
+                <w:sz w:val="28"/>
+              </w:rPr>
+              <w:t>ใช้เช็กก่อนเลือกเอกสาร</w:t>
+            </w:r>
+          </w:p>
+        </w:tc>
+      </w:tr>
+      <w:tr>
+        <w:tc>
+          <w:tcPr>
+            <w:tcW w:type="dxa" w:w="3312"/>
+          </w:tcPr>
+          <w:p>
+            <w:r>
+              <w:t>ตัวกรอง_date_from / ตัวกรอง_date_to</w:t>
+            </w:r>
+          </w:p>
+        </w:tc>
+        <w:tc>
+          <w:tcPr>
+            <w:tcW w:type="dxa" w:w="3312"/>
+          </w:tcPr>
+          <w:p>
+            <w:r>
+              <w:rPr>
+                <w:rFonts w:ascii="TH Sarabun New" w:hAnsi="TH Sarabun New" w:eastAsia="TH Sarabun New"/>
+                <w:sz w:val="28"/>
+              </w:rPr>
+              <w:t>กรองช่วงวันที่เอกสารที่จะดึงเข้ามา</w:t>
+            </w:r>
+          </w:p>
+        </w:tc>
+        <w:tc>
+          <w:tcPr>
+            <w:tcW w:type="dxa" w:w="3312"/>
+          </w:tcPr>
+          <w:p>
+            <w:r>
+              <w:rPr>
+                <w:rFonts w:ascii="TH Sarabun New" w:hAnsi="TH Sarabun New" w:eastAsia="TH Sarabun New"/>
+                <w:sz w:val="28"/>
+              </w:rPr>
+              <w:t>ช่วยตัดรายการเก่าหรืออนาคตออก</w:t>
+            </w:r>
+          </w:p>
+        </w:tc>
+      </w:tr>
+      <w:tr>
+        <w:tc>
+          <w:tcPr>
+            <w:tcW w:type="dxa" w:w="3312"/>
+          </w:tcPr>
+          <w:p>
+            <w:r>
+              <w:t>ตัวกรอง_min_amount</w:t>
+            </w:r>
+          </w:p>
+        </w:tc>
+        <w:tc>
+          <w:tcPr>
+            <w:tcW w:type="dxa" w:w="3312"/>
+          </w:tcPr>
+          <w:p>
+            <w:r>
+              <w:rPr>
+                <w:rFonts w:ascii="TH Sarabun New" w:hAnsi="TH Sarabun New" w:eastAsia="TH Sarabun New"/>
+                <w:sz w:val="28"/>
+              </w:rPr>
+              <w:t>กรองรายการที่ยอดค้างต่ำกว่าเกณฑ์</w:t>
+            </w:r>
+          </w:p>
+        </w:tc>
+        <w:tc>
+          <w:tcPr>
+            <w:tcW w:type="dxa" w:w="3312"/>
+          </w:tcPr>
+          <w:p>
+            <w:r>
+              <w:rPr>
+                <w:rFonts w:ascii="TH Sarabun New" w:hAnsi="TH Sarabun New" w:eastAsia="TH Sarabun New"/>
+                <w:sz w:val="28"/>
+              </w:rPr>
+              <w:t>ช่วยลดรายการย่อยที่ไม่ต้องการรับชำระ</w:t>
+            </w:r>
+          </w:p>
+        </w:tc>
+      </w:tr>
+      <w:tr>
+        <w:tc>
+          <w:tcPr>
+            <w:tcW w:type="dxa" w:w="3312"/>
+          </w:tcPr>
+          <w:p>
+            <w:r>
+              <w:rPr>
+                <w:rFonts w:ascii="TH Sarabun New" w:hAnsi="TH Sarabun New" w:eastAsia="TH Sarabun New"/>
+                <w:sz w:val="28"/>
+              </w:rPr>
+              <w:t>line_ids</w:t>
+            </w:r>
+          </w:p>
+        </w:tc>
+        <w:tc>
+          <w:tcPr>
+            <w:tcW w:type="dxa" w:w="3312"/>
+          </w:tcPr>
+          <w:p>
+            <w:r>
+              <w:rPr>
+                <w:rFonts w:ascii="TH Sarabun New" w:hAnsi="TH Sarabun New" w:eastAsia="TH Sarabun New"/>
+                <w:sz w:val="28"/>
+              </w:rPr>
+              <w:t>ตารางเอกสารที่พบ พร้อมยอดรวม ยอดค้าง และยอดที่จะรับชำระ</w:t>
+            </w:r>
+          </w:p>
+        </w:tc>
+        <w:tc>
+          <w:tcPr>
+            <w:tcW w:type="dxa" w:w="3312"/>
+          </w:tcPr>
+          <w:p>
+            <w:r>
+              <w:rPr>
+                <w:rFonts w:ascii="TH Sarabun New" w:hAnsi="TH Sarabun New" w:eastAsia="TH Sarabun New"/>
+                <w:sz w:val="28"/>
+              </w:rPr>
+              <w:t>ช่อง is_selected ใช้เลือกเอกสารที่จะรับจริง</w:t>
+            </w:r>
+          </w:p>
+        </w:tc>
+      </w:tr>
+    </w:tbl>
+    <w:p>
+      <w:r>
+        <w:t>สิ่งที่ควรตรวจสอบก่อนบันทึก</w:t>
       </w:r>
     </w:p>
     <w:p>
@@ -1355,12 +1273,6 @@
         <w:t>ถ้าเลือก Journal ผิด รายการเดบิต/เครดิตจะไปลงบัญชีพักคนละชุดทันที จึงควรตรวจสอบใน Payment Register ก่อนกด Create Payment</w:t>
       </w:r>
     </w:p>
-    <w:sectPr>
-      <w:pgSz w:w="12240" w:h="15840"/>
-      <w:pgMar w:top="1008" w:right="1152" w:bottom="1008" w:left="1152" w:header="720" w:footer="720" w:gutter="0"/>
-      <w:cols w:space="720"/>
-      <w:docGrid w:linePitch="360"/>
-    </w:sectPr>
   </w:body>
 </w:document>
 </file>

</xml_diff>

<commit_message>
feat: implement multiple Odoo custom modules and add automation/reporting tools
</commit_message>
<xml_diff>
--- a/manual/Accouting_Manual/generated_20260408/docx/3.8_3.8 การจัดการการรับชำระแบบกลุ่มบริษัท.docx
+++ b/manual/Accouting_Manual/generated_20260408/docx/3.8_3.8 การจัดการการรับชำระแบบกลุ่มบริษัท.docx
@@ -2,379 +2,289 @@
 <file path=word/document.xml><?xml version="1.0" encoding="utf-8"?>
 <w:document xmlns:wpc="http://schemas.microsoft.com/office/word/2010/wordprocessingCanvas" xmlns:mo="http://schemas.microsoft.com/office/mac/office/2008/main" xmlns:mc="http://schemas.openxmlformats.org/markup-compatibility/2006" xmlns:mv="urn:schemas-microsoft-com:mac:vml" xmlns:o="urn:schemas-microsoft-com:office:office" xmlns:r="http://schemas.openxmlformats.org/officeDocument/2006/relationships" xmlns:m="http://schemas.openxmlformats.org/officeDocument/2006/math" xmlns:v="urn:schemas-microsoft-com:vml" xmlns:wp14="http://schemas.microsoft.com/office/word/2010/wordprocessingDrawing" xmlns:wp="http://schemas.openxmlformats.org/drawingml/2006/wordprocessingDrawing" xmlns:w10="urn:schemas-microsoft-com:office:word" xmlns:w="http://schemas.openxmlformats.org/wordprocessingml/2006/main" xmlns:w14="http://schemas.microsoft.com/office/word/2010/wordml" xmlns:wpg="http://schemas.microsoft.com/office/word/2010/wordprocessingGroup" xmlns:wpi="http://schemas.microsoft.com/office/word/2010/wordprocessingInk" xmlns:wne="http://schemas.microsoft.com/office/word/2006/wordml" xmlns:wps="http://schemas.microsoft.com/office/word/2010/wordprocessingShape" mc:Ignorable="w14 wp14">
   <w:body>
-    <w:sectPr>
-      <w:pgSz w:w="12240" w:h="15840"/>
-      <w:pgMar w:top="1008" w:right="1152" w:bottom="1008" w:left="1152" w:header="720" w:footer="720" w:gutter="0"/>
-      <w:cols w:space="720"/>
-      <w:docGrid w:linePitch="360"/>
-    </w:sectPr>
     <w:p>
       <w:pPr>
-        <w:jc w:val="center"/>
+        <w:spacing w:after="60"/>
+        <w:keepLines/>
       </w:pPr>
       <w:r>
         <w:rPr>
-          <w:rFonts w:ascii="TH Sarabun New" w:hAnsi="TH Sarabun New" w:eastAsia="TH Sarabun New"/>
+          <w:rFonts w:ascii="Angsana New" w:hAnsi="Angsana New" w:eastAsia="Angsana New"/>
           <w:b/>
-          <w:color w:val="1F4E79"/>
-          <w:sz w:val="48"/>
+          <w:sz w:val="32"/>
         </w:rPr>
         <w:t>3.8 การจัดการการรับชำระแบบกลุ่มบริษัท</w:t>
       </w:r>
     </w:p>
     <w:p>
       <w:pPr>
-        <w:jc w:val="center"/>
+        <w:spacing w:after="200"/>
+        <w:keepLines/>
       </w:pPr>
       <w:r>
         <w:rPr>
-          <w:rFonts w:ascii="TH Sarabun New" w:hAnsi="TH Sarabun New" w:eastAsia="TH Sarabun New"/>
-          <w:sz w:val="36"/>
+          <w:rFonts w:ascii="Angsana New" w:hAnsi="Angsana New" w:eastAsia="Angsana New"/>
+          <w:b w:val="0"/>
+          <w:sz w:val="32"/>
         </w:rPr>
-        <w:t>Account Receivable</w:t>
+        <w:t>คู่มือนี้อธิบายการรับชำระเงินแบบกลุ่มบริษัทด้วยภาษาที่ผู้ใช้งานทั่วไปอ่านแล้วทำตามได้ทันที โดยเริ่มตั้งแต่การเข้าเมนู การเปิดรายการ การเลือกใบแจ้งหนี้ที่ต้องการรับเงิน ไปจนถึงการกลับมาตรวจผลทางบัญชีหลังบันทึกรายการเสร็จ</w:t>
+      </w:r>
+    </w:p>
+    <w:p>
+      <w:pPr>
+        <w:spacing w:after="80"/>
+        <w:keepLines/>
+        <w:keepNext/>
+      </w:pPr>
+      <w:r>
+        <w:rPr>
+          <w:rFonts w:ascii="Angsana New" w:hAnsi="Angsana New" w:eastAsia="Angsana New"/>
+          <w:b/>
+          <w:sz w:val="32"/>
+        </w:rPr>
+        <w:t>สารบัญ</w:t>
+      </w:r>
+    </w:p>
+    <w:p>
+      <w:pPr>
+        <w:spacing w:after="40"/>
+        <w:keepLines/>
+      </w:pPr>
+      <w:r>
+        <w:rPr>
+          <w:rFonts w:ascii="Angsana New" w:hAnsi="Angsana New" w:eastAsia="Angsana New"/>
+          <w:b w:val="0"/>
+          <w:sz w:val="32"/>
+        </w:rPr>
+        <w:t>1. วัตถุประสงค์</w:t>
+      </w:r>
+    </w:p>
+    <w:p>
+      <w:pPr>
+        <w:spacing w:after="40"/>
+        <w:keepLines/>
+      </w:pPr>
+      <w:r>
+        <w:rPr>
+          <w:rFonts w:ascii="Angsana New" w:hAnsi="Angsana New" w:eastAsia="Angsana New"/>
+          <w:b w:val="0"/>
+          <w:sz w:val="32"/>
+        </w:rPr>
+        <w:t>2. ภาพรวมการทำงาน</w:t>
+      </w:r>
+    </w:p>
+    <w:p>
+      <w:pPr>
+        <w:spacing w:after="40"/>
+        <w:keepLines/>
+      </w:pPr>
+      <w:r>
+        <w:rPr>
+          <w:rFonts w:ascii="Angsana New" w:hAnsi="Angsana New" w:eastAsia="Angsana New"/>
+          <w:b w:val="0"/>
+          <w:sz w:val="32"/>
+        </w:rPr>
+        <w:t>3. เมนูที่ใช้</w:t>
+      </w:r>
+    </w:p>
+    <w:p>
+      <w:pPr>
+        <w:spacing w:after="40"/>
+        <w:keepLines/>
+      </w:pPr>
+      <w:r>
+        <w:rPr>
+          <w:rFonts w:ascii="Angsana New" w:hAnsi="Angsana New" w:eastAsia="Angsana New"/>
+          <w:b w:val="0"/>
+          <w:sz w:val="32"/>
+        </w:rPr>
+        <w:t>4. ขั้นตอนการใช้งาน</w:t>
+      </w:r>
+    </w:p>
+    <w:p>
+      <w:pPr>
+        <w:spacing w:after="40"/>
+        <w:keepLines/>
+      </w:pPr>
+      <w:r>
+        <w:rPr>
+          <w:rFonts w:ascii="Angsana New" w:hAnsi="Angsana New" w:eastAsia="Angsana New"/>
+          <w:b w:val="0"/>
+          <w:sz w:val="32"/>
+        </w:rPr>
+        <w:t>5. ตรวจสอบ Journal Entry</w:t>
+      </w:r>
+    </w:p>
+    <w:p>
+      <w:pPr>
+        <w:spacing w:after="40"/>
+        <w:keepLines/>
+      </w:pPr>
+      <w:r>
+        <w:rPr>
+          <w:rFonts w:ascii="Angsana New" w:hAnsi="Angsana New" w:eastAsia="Angsana New"/>
+          <w:b w:val="0"/>
+          <w:sz w:val="32"/>
+        </w:rPr>
+        <w:t>6. ข้อควรระวัง</w:t>
       </w:r>
     </w:p>
     <w:p/>
     <w:p>
+      <w:pPr>
+        <w:spacing w:after="80"/>
+        <w:keepLines/>
+        <w:keepNext/>
+      </w:pPr>
       <w:r>
         <w:rPr>
-          <w:rFonts w:ascii="TH Sarabun New" w:hAnsi="TH Sarabun New" w:eastAsia="TH Sarabun New"/>
+          <w:rFonts w:ascii="Angsana New" w:hAnsi="Angsana New" w:eastAsia="Angsana New"/>
           <w:b/>
-          <w:color w:val="1F4E79"/>
-          <w:sz w:val="36"/>
+          <w:sz w:val="32"/>
         </w:rPr>
         <w:t>วัตถุประสงค์</w:t>
       </w:r>
     </w:p>
     <w:p>
       <w:pPr>
-        <w:pStyle w:val="ListBullet"/>
+        <w:spacing w:after="120"/>
+        <w:keepLines/>
       </w:pPr>
       <w:r>
         <w:rPr>
-          <w:rFonts w:ascii="TH Sarabun New" w:hAnsi="TH Sarabun New" w:eastAsia="TH Sarabun New"/>
+          <w:rFonts w:ascii="Angsana New" w:hAnsi="Angsana New" w:eastAsia="Angsana New"/>
+          <w:b w:val="0"/>
           <w:sz w:val="32"/>
         </w:rPr>
-        <w:t>เพื่อให้ผู้ใช้สามารถรวมลูกหนี้หลายรายที่อยู่ภายใต้กลุ่มบริษัทเดียวกันมารับชำระในรอบเดียว</w:t>
+        <w:t>เพื่อให้ผู้ใช้งานสามารถรับชำระเงินจากลูกค้าหลายรายในกลุ่มเดียวกันได้จากเอกสารเดียว</w:t>
       </w:r>
     </w:p>
     <w:p>
       <w:pPr>
-        <w:pStyle w:val="ListBullet"/>
+        <w:spacing w:after="200"/>
+        <w:keepLines/>
       </w:pPr>
       <w:r>
-        <w:t>เพื่อให้ผู้ใช้รู้วิธีค้นหาเอกสารคงค้าง เลือกยอดที่จะรับ และเปิด หน้าต่าง รับชำระเงินได้ถูกต้อง</w:t>
+        <w:rPr>
+          <w:rFonts w:ascii="Angsana New" w:hAnsi="Angsana New" w:eastAsia="Angsana New"/>
+          <w:b w:val="0"/>
+          <w:sz w:val="32"/>
+        </w:rPr>
+        <w:t>เพื่อให้ผู้ใช้งานตรวจสอบได้ว่าระบบตัดยอดลูกหนี้ถูกใบ ถูกยอด และลงบัญชีถูกต้อง</w:t>
       </w:r>
     </w:p>
     <w:p>
       <w:pPr>
-        <w:pStyle w:val="ListBullet"/>
+        <w:spacing w:after="80"/>
+        <w:keepLines/>
+        <w:keepNext/>
       </w:pPr>
       <w:r>
         <w:rPr>
-          <w:rFonts w:ascii="TH Sarabun New" w:hAnsi="TH Sarabun New" w:eastAsia="TH Sarabun New"/>
+          <w:rFonts w:ascii="Angsana New" w:hAnsi="Angsana New" w:eastAsia="Angsana New"/>
+          <w:b/>
           <w:sz w:val="32"/>
-        </w:rPr>
-        <w:t>เพื่อให้ตรวจสอบผลลัพธ์หลังรับชำระได้ทั้งระดับใบรับชำระและ Journal Items</w:t>
-      </w:r>
-    </w:p>
-    <w:p>
-      <w:r>
-        <w:rPr>
-          <w:rFonts w:ascii="TH Sarabun New" w:hAnsi="TH Sarabun New" w:eastAsia="TH Sarabun New"/>
-          <w:b/>
-          <w:color w:val="1F4E79"/>
-          <w:sz w:val="36"/>
         </w:rPr>
         <w:t>ภาพรวมการทำงาน</w:t>
       </w:r>
     </w:p>
     <w:p>
       <w:pPr>
-        <w:pStyle w:val="ListBullet"/>
+        <w:spacing w:after="120"/>
+        <w:keepLines/>
       </w:pPr>
       <w:r>
-        <w:t>เมนูนี้เป็น เมนูเสริม สำหรับงานรับชำระแบบกลุ่มบริษัท โดยผู้ใช้เลือกสมาชิกในกลุ่มก่อน แล้วให้ระบบค้นหาใบแจ้งหนี้ที่ค้างชำระของสมาชิกที่เลือก จากนั้นจึงเปิดหน้ารับชำระมาตรฐานของ Odoo เพื่อสร้างรายการรับเงินจริง.</w:t>
+        <w:rPr>
+          <w:rFonts w:ascii="Angsana New" w:hAnsi="Angsana New" w:eastAsia="Angsana New"/>
+          <w:b w:val="0"/>
+          <w:sz w:val="32"/>
+        </w:rPr>
+        <w:t>หัวข้อนี้ใช้กับกรณีที่ลูกค้าในเครือหรือกลุ่มบริษัทชำระเงินรวมกันครั้งเดียว ผู้ใช้งานจึงต้องเลือกรายการค้างชำระของสมาชิกแต่ละรายให้ถูกต้องก่อนบันทึกรับเงิน</w:t>
       </w:r>
     </w:p>
     <w:p>
       <w:pPr>
-        <w:pStyle w:val="ListBullet"/>
+        <w:spacing w:after="200"/>
+        <w:keepLines/>
       </w:pPr>
       <w:r>
-        <w:t>ในระบบมีทั้งเอกสารรับชำระแบบกลุ่มบริษัทที่อยู่ระหว่างเตรียมรายการ และเอกสารที่บันทึกรับชำระแล้ว โดยคู่มือนี้จะอธิบายให้ผู้ใช้เห็นทั้งขั้นตอนก่อนสร้าง payment และการตรวจสอบผลหลังสร้าง payment จากข้อมูลจริงในระบบ.</w:t>
-      </w:r>
-    </w:p>
-    <w:p>
-      <w:r>
-        <w:t>สิ่งที่ทำได้ในหน้าจอนี้</w:t>
-      </w:r>
-    </w:p>
-    <w:tbl>
-      <w:tblPr>
-        <w:tblStyle w:val="TableGrid"/>
-        <w:tblW w:type="auto" w:w="0"/>
-        <w:tblLook w:firstColumn="1" w:firstRow="1" w:lastColumn="0" w:lastRow="0" w:noHBand="0" w:noVBand="1" w:val="04A0"/>
-      </w:tblPr>
-      <w:tblGrid>
-        <w:gridCol w:w="3312"/>
-        <w:gridCol w:w="3312"/>
-        <w:gridCol w:w="3312"/>
-      </w:tblGrid>
-      <w:tr>
-        <w:tc>
-          <w:tcPr>
-            <w:tcW w:type="dxa" w:w="3312"/>
-            <w:shd w:fill="D9EAF7"/>
-          </w:tcPr>
-          <w:p>
-            <w:r>
-              <w:rPr>
-                <w:rFonts w:ascii="TH Sarabun New" w:hAnsi="TH Sarabun New" w:eastAsia="TH Sarabun New"/>
-                <w:sz w:val="28"/>
-              </w:rPr>
-              <w:t>ฟังก์ชัน</w:t>
-            </w:r>
-          </w:p>
-        </w:tc>
-        <w:tc>
-          <w:tcPr>
-            <w:tcW w:type="dxa" w:w="3312"/>
-            <w:shd w:fill="D9EAF7"/>
-          </w:tcPr>
-          <w:p>
-            <w:r>
-              <w:rPr>
-                <w:rFonts w:ascii="TH Sarabun New" w:hAnsi="TH Sarabun New" w:eastAsia="TH Sarabun New"/>
-                <w:sz w:val="28"/>
-              </w:rPr>
-              <w:t>คำอธิบาย</w:t>
-            </w:r>
-          </w:p>
-        </w:tc>
-        <w:tc>
-          <w:tcPr>
-            <w:tcW w:type="dxa" w:w="3312"/>
-            <w:shd w:fill="D9EAF7"/>
-          </w:tcPr>
-          <w:p>
-            <w:r>
-              <w:rPr>
-                <w:rFonts w:ascii="TH Sarabun New" w:hAnsi="TH Sarabun New" w:eastAsia="TH Sarabun New"/>
-                <w:sz w:val="28"/>
-              </w:rPr>
-              <w:t>ใช้เมื่อไร</w:t>
-            </w:r>
-          </w:p>
-        </w:tc>
-      </w:tr>
-      <w:tr>
-        <w:tc>
-          <w:tcPr>
-            <w:tcW w:type="dxa" w:w="3312"/>
-          </w:tcPr>
-          <w:p>
-            <w:r>
-              <w:rPr>
-                <w:rFonts w:ascii="TH Sarabun New" w:hAnsi="TH Sarabun New" w:eastAsia="TH Sarabun New"/>
-                <w:sz w:val="28"/>
-              </w:rPr>
-              <w:t>ค้นหาเอกสาร</w:t>
-            </w:r>
-          </w:p>
-        </w:tc>
-        <w:tc>
-          <w:tcPr>
-            <w:tcW w:type="dxa" w:w="3312"/>
-          </w:tcPr>
-          <w:p>
-            <w:r>
-              <w:rPr>
-                <w:rFonts w:ascii="TH Sarabun New" w:hAnsi="TH Sarabun New" w:eastAsia="TH Sarabun New"/>
-                <w:sz w:val="28"/>
-              </w:rPr>
-              <w:t>ดึง invoice/out_invoice และใบลดหนี้ของลูกค้าที่เลือกซึ่งยังค้างชำระอยู่เข้ามาในตาราง line_ids</w:t>
-            </w:r>
-          </w:p>
-        </w:tc>
-        <w:tc>
-          <w:tcPr>
-            <w:tcW w:type="dxa" w:w="3312"/>
-          </w:tcPr>
-          <w:p>
-            <w:r>
-              <w:t>ใช้หลังจากเลือกสมาชิกหรือเปลี่ยน ตัวกรอง</w:t>
-            </w:r>
-          </w:p>
-        </w:tc>
-      </w:tr>
-      <w:tr>
-        <w:tc>
-          <w:tcPr>
-            <w:tcW w:type="dxa" w:w="3312"/>
-          </w:tcPr>
-          <w:p>
-            <w:r>
-              <w:rPr>
-                <w:rFonts w:ascii="TH Sarabun New" w:hAnsi="TH Sarabun New" w:eastAsia="TH Sarabun New"/>
-                <w:sz w:val="28"/>
-              </w:rPr>
-              <w:t>ดำเนินการรับชำระ</w:t>
-            </w:r>
-          </w:p>
-        </w:tc>
-        <w:tc>
-          <w:tcPr>
-            <w:tcW w:type="dxa" w:w="3312"/>
-          </w:tcPr>
-          <w:p>
-            <w:r>
-              <w:rPr>
-                <w:rFonts w:ascii="TH Sarabun New" w:hAnsi="TH Sarabun New" w:eastAsia="TH Sarabun New"/>
-                <w:sz w:val="28"/>
-              </w:rPr>
-              <w:t>เปิดหน้าต่าง Account Payment Register ของ Odoo เพื่อให้กำหนด Journal, Payment Method และสร้าง payment จริง</w:t>
-            </w:r>
-          </w:p>
-        </w:tc>
-        <w:tc>
-          <w:tcPr>
-            <w:tcW w:type="dxa" w:w="3312"/>
-          </w:tcPr>
-          <w:p>
-            <w:r>
-              <w:rPr>
-                <w:rFonts w:ascii="TH Sarabun New" w:hAnsi="TH Sarabun New" w:eastAsia="TH Sarabun New"/>
-                <w:sz w:val="28"/>
-              </w:rPr>
-              <w:t>ใช้เมื่อเลือกรายการที่จะรับชำระครบแล้ว</w:t>
-            </w:r>
-          </w:p>
-        </w:tc>
-      </w:tr>
-      <w:tr>
-        <w:tc>
-          <w:tcPr>
-            <w:tcW w:type="dxa" w:w="3312"/>
-          </w:tcPr>
-          <w:p>
-            <w:r>
-              <w:rPr>
-                <w:rFonts w:ascii="TH Sarabun New" w:hAnsi="TH Sarabun New" w:eastAsia="TH Sarabun New"/>
-                <w:sz w:val="28"/>
-              </w:rPr>
-              <w:t>พิมพ์ใบสำคัญ</w:t>
-            </w:r>
-          </w:p>
-        </w:tc>
-        <w:tc>
-          <w:tcPr>
-            <w:tcW w:type="dxa" w:w="3312"/>
-          </w:tcPr>
-          <w:p>
-            <w:r>
-              <w:rPr>
-                <w:rFonts w:ascii="TH Sarabun New" w:hAnsi="TH Sarabun New" w:eastAsia="TH Sarabun New"/>
-                <w:sz w:val="28"/>
-              </w:rPr>
-              <w:t>พิมพ์เอกสารยืนยันการรับชำระหลังรายการอยู่สถานะ Done</w:t>
-            </w:r>
-          </w:p>
-        </w:tc>
-        <w:tc>
-          <w:tcPr>
-            <w:tcW w:type="dxa" w:w="3312"/>
-          </w:tcPr>
-          <w:p>
-            <w:r>
-              <w:rPr>
-                <w:rFonts w:ascii="TH Sarabun New" w:hAnsi="TH Sarabun New" w:eastAsia="TH Sarabun New"/>
-                <w:sz w:val="28"/>
-              </w:rPr>
-              <w:t>ใช้หลังบันทึกรับชำระสำเร็จ</w:t>
-            </w:r>
-          </w:p>
-        </w:tc>
-      </w:tr>
-      <w:tr>
-        <w:tc>
-          <w:tcPr>
-            <w:tcW w:type="dxa" w:w="3312"/>
-          </w:tcPr>
-          <w:p>
-            <w:r>
-              <w:rPr>
-                <w:rFonts w:ascii="TH Sarabun New" w:hAnsi="TH Sarabun New" w:eastAsia="TH Sarabun New"/>
-                <w:sz w:val="28"/>
-              </w:rPr>
-              <w:t>ดูรายการชำระเงิน</w:t>
-            </w:r>
-          </w:p>
-        </w:tc>
-        <w:tc>
-          <w:tcPr>
-            <w:tcW w:type="dxa" w:w="3312"/>
-          </w:tcPr>
-          <w:p>
-            <w:r>
-              <w:rPr>
-                <w:rFonts w:ascii="TH Sarabun New" w:hAnsi="TH Sarabun New" w:eastAsia="TH Sarabun New"/>
-                <w:sz w:val="28"/>
-              </w:rPr>
-              <w:t>เปิดรายการ payment ที่ระบบสร้างจาก group payment ใบนั้น</w:t>
-            </w:r>
-          </w:p>
-        </w:tc>
-        <w:tc>
-          <w:tcPr>
-            <w:tcW w:type="dxa" w:w="3312"/>
-          </w:tcPr>
-          <w:p>
-            <w:r>
-              <w:rPr>
-                <w:rFonts w:ascii="TH Sarabun New" w:hAnsi="TH Sarabun New" w:eastAsia="TH Sarabun New"/>
-                <w:sz w:val="28"/>
-              </w:rPr>
-              <w:t>ใช้ตรวจสอบผลการบันทึก</w:t>
-            </w:r>
-          </w:p>
-        </w:tc>
-      </w:tr>
-    </w:tbl>
-    <w:p>
-      <w:r>
-        <w:t>1. เข้าใช้งานจากหน้าหลัก</w:t>
+        <w:rPr>
+          <w:rFonts w:ascii="Angsana New" w:hAnsi="Angsana New" w:eastAsia="Angsana New"/>
+          <w:b w:val="0"/>
+          <w:sz w:val="32"/>
+        </w:rPr>
+        <w:t>เมื่อบันทึกรายการแล้ว ระบบจะสร้างข้อมูลรับชำระ และตัดยอดใบแจ้งหนี้ที่เลือกไว้ ดังนั้นขั้นตอนที่สำคัญที่สุดคือการตรวจรายชื่อลูกค้า เลขใบแจ้งหนี้ และยอดรวมก่อนกดยืนยัน</w:t>
       </w:r>
     </w:p>
     <w:p>
       <w:pPr>
-        <w:pStyle w:val="ListBullet"/>
+        <w:spacing w:after="80"/>
+        <w:keepLines/>
+        <w:keepNext/>
       </w:pPr>
       <w:r>
         <w:rPr>
-          <w:rFonts w:ascii="TH Sarabun New" w:hAnsi="TH Sarabun New" w:eastAsia="TH Sarabun New"/>
+          <w:rFonts w:ascii="Angsana New" w:hAnsi="Angsana New" w:eastAsia="Angsana New"/>
+          <w:b/>
+          <w:sz w:val="32"/>
+        </w:rPr>
+        <w:t>เมนูที่ใช้</w:t>
+      </w:r>
+    </w:p>
+    <w:p>
+      <w:pPr>
+        <w:spacing w:after="200"/>
+        <w:keepLines/>
+      </w:pPr>
+      <w:r>
+        <w:rPr>
+          <w:rFonts w:ascii="Angsana New" w:hAnsi="Angsana New" w:eastAsia="Angsana New"/>
+          <w:b w:val="0"/>
           <w:sz w:val="32"/>
         </w:rPr>
         <w:t>Accounting &gt; Customers &gt; รับชำระเงินกลุ่มลูกค้า</w:t>
       </w:r>
     </w:p>
     <w:p>
+      <w:pPr>
+        <w:spacing w:after="80"/>
+        <w:keepLines/>
+        <w:keepNext/>
+      </w:pPr>
       <w:r>
         <w:rPr>
-          <w:b w:val="0"/>
+          <w:rFonts w:ascii="Angsana New" w:hAnsi="Angsana New" w:eastAsia="Angsana New"/>
+          <w:b/>
+          <w:sz w:val="32"/>
         </w:rPr>
-        <w:t>ให้เริ่มจากหน้า Dashboard แล้วกดเข้าโมดูลตามภาพ จากนั้นกดเมนูย่อยตามหมายเลขในภาพเพื่อเข้าสู่หน้าที่ใช้ทำรายการจริง.</w:t>
+        <w:t>3. ขั้นตอนการใช้งาน</w:t>
       </w:r>
     </w:p>
     <w:p>
       <w:pPr>
+        <w:spacing w:after="120"/>
+        <w:keepLines/>
+      </w:pPr>
+      <w:r>
+        <w:rPr>
+          <w:rFonts w:ascii="Angsana New" w:hAnsi="Angsana New" w:eastAsia="Angsana New"/>
+          <w:b w:val="0"/>
+          <w:sz w:val="32"/>
+        </w:rPr>
+        <w:t>1. เริ่มจากหน้า Dashboard ของระบบ แล้วมองหาการ์ดของโมดูล Accounting เพื่อเข้าไปทำรายการรับเงิน</w:t>
+      </w:r>
+    </w:p>
+    <w:p>
+      <w:pPr>
+        <w:spacing w:after="60"/>
         <w:jc w:val="center"/>
+        <w:keepLines/>
       </w:pPr>
       <w:r>
         <w:drawing>
           <wp:inline xmlns:a="http://schemas.openxmlformats.org/drawingml/2006/main" xmlns:pic="http://schemas.openxmlformats.org/drawingml/2006/picture">
-            <wp:extent cx="5852160" cy="4389120"/>
-            <wp:docPr id="7" name="Picture 7"/>
+            <wp:extent cx="5577840" cy="4183380"/>
+            <wp:docPr id="1" name="Picture 1"/>
             <wp:cNvGraphicFramePr>
               <a:graphicFrameLocks noChangeAspect="1"/>
             </wp:cNvGraphicFramePr>
@@ -382,11 +292,11 @@
               <a:graphicData uri="http://schemas.openxmlformats.org/drawingml/2006/picture">
                 <pic:pic>
                   <pic:nvPicPr>
-                    <pic:cNvPr id="0" name="image.png"/>
+                    <pic:cNvPr id="0" name="nav_dashboard_accounting_real_annotated.png"/>
                     <pic:cNvPicPr/>
                   </pic:nvPicPr>
                   <pic:blipFill>
-                    <a:blip r:embed="rId12"/>
+                    <a:blip r:embed="rId9"/>
                     <a:stretch>
                       <a:fillRect/>
                     </a:stretch>
@@ -394,7 +304,7 @@
                   <pic:spPr>
                     <a:xfrm>
                       <a:off x="0" y="0"/>
-                      <a:ext cx="5852160" cy="4389120"/>
+                      <a:ext cx="5577840" cy="4183380"/>
                     </a:xfrm>
                     <a:prstGeom prst="rect"/>
                   </pic:spPr>
@@ -407,21 +317,45 @@
     </w:p>
     <w:p>
       <w:pPr>
+        <w:spacing w:after="160"/>
         <w:jc w:val="center"/>
+        <w:keepLines/>
+        <w:keepLines/>
       </w:pPr>
       <w:r>
-        <w:t>รูป 3.8A.1 หน้า Dashboard สำหรับเข้าโมดูล Accounting</w:t>
+        <w:rPr>
+          <w:rFonts w:ascii="Angsana New" w:hAnsi="Angsana New" w:eastAsia="Angsana New"/>
+          <w:b w:val="0"/>
+          <w:sz w:val="32"/>
+        </w:rPr>
+        <w:t>ภาพขั้นตอนที่ 1 จุดเริ่มต้นจากหน้า Dashboard</w:t>
       </w:r>
     </w:p>
     <w:p>
       <w:pPr>
+        <w:spacing w:after="120"/>
+        <w:keepLines/>
+      </w:pPr>
+      <w:r>
+        <w:rPr>
+          <w:rFonts w:ascii="Angsana New" w:hAnsi="Angsana New" w:eastAsia="Angsana New"/>
+          <w:b w:val="0"/>
+          <w:sz w:val="32"/>
+        </w:rPr>
+        <w:t>2. เมื่อเข้าสู่โมดูล Accounting แล้ว ให้ไปที่เมนู Accounting &gt; Customers &gt; รับชำระเงินกลุ่มลูกค้า เมนูนี้เป็นจุดรวมเอกสารรับเงินของลูกค้าหลายรายในกลุ่มเดียวกัน</w:t>
+      </w:r>
+    </w:p>
+    <w:p>
+      <w:pPr>
+        <w:spacing w:after="60"/>
         <w:jc w:val="center"/>
+        <w:keepLines/>
       </w:pPr>
       <w:r>
         <w:drawing>
           <wp:inline xmlns:a="http://schemas.openxmlformats.org/drawingml/2006/main" xmlns:pic="http://schemas.openxmlformats.org/drawingml/2006/picture">
-            <wp:extent cx="5852160" cy="4389120"/>
-            <wp:docPr id="8" name="Picture 8"/>
+            <wp:extent cx="5577840" cy="4183380"/>
+            <wp:docPr id="2" name="Picture 2"/>
             <wp:cNvGraphicFramePr>
               <a:graphicFrameLocks noChangeAspect="1"/>
             </wp:cNvGraphicFramePr>
@@ -429,11 +363,11 @@
               <a:graphicData uri="http://schemas.openxmlformats.org/drawingml/2006/picture">
                 <pic:pic>
                   <pic:nvPicPr>
-                    <pic:cNvPr id="0" name="image.png"/>
+                    <pic:cNvPr id="0" name="nav_accounting_group_payment_real_annotated.png"/>
                     <pic:cNvPicPr/>
                   </pic:nvPicPr>
                   <pic:blipFill>
-                    <a:blip r:embed="rId13"/>
+                    <a:blip r:embed="rId10"/>
                     <a:stretch>
                       <a:fillRect/>
                     </a:stretch>
@@ -441,7 +375,7 @@
                   <pic:spPr>
                     <a:xfrm>
                       <a:off x="0" y="0"/>
-                      <a:ext cx="5852160" cy="4389120"/>
+                      <a:ext cx="5577840" cy="4183380"/>
                     </a:xfrm>
                     <a:prstGeom prst="rect"/>
                   </pic:spPr>
@@ -454,472 +388,45 @@
     </w:p>
     <w:p>
       <w:pPr>
+        <w:spacing w:after="160"/>
         <w:jc w:val="center"/>
+        <w:keepLines/>
+        <w:keepLines/>
       </w:pPr>
       <w:r>
-        <w:t>รูป 3.8A.2 เมนู Accounting &gt; Customers &gt; รับชำระเงินกลุ่มลูกค้า</w:t>
-      </w:r>
-    </w:p>
-    <w:p>
-      <w:r>
-        <w:t>2. ขั้นตอนการทำรายการ</w:t>
-      </w:r>
-    </w:p>
-    <w:p>
-      <w:r>
         <w:rPr>
-          <w:rFonts w:ascii="TH Sarabun New" w:hAnsi="TH Sarabun New" w:eastAsia="TH Sarabun New"/>
-          <w:b/>
+          <w:rFonts w:ascii="Angsana New" w:hAnsi="Angsana New" w:eastAsia="Angsana New"/>
+          <w:b w:val="0"/>
           <w:sz w:val="32"/>
         </w:rPr>
-        <w:t>ขั้นตอนการเปิดและค้นหาเอกสารคงค้าง</w:t>
-      </w:r>
-    </w:p>
-    <w:p>
-      <w:r>
-        <w:t>1. เข้าเมนู Accounting &gt; Customers &gt; รับชำระเงินกลุ่มลูกค้า แล้วกด New เพื่อสร้างเอกสารใหม่ หรือเปิดเอกสารจริงที่ผู้ใช้งานต้องการตรวจสอบเพื่อดูรายการที่ค้างชำระอยู่ในระบบ.</w:t>
-      </w:r>
-    </w:p>
-    <w:p>
-      <w:r>
-        <w:t>2. ในช่อง ลูกค้า/สมาชิกกลุ่ม ให้เลือกคู่ค้าที่อยู่ภายใต้กลุ่มเดียวกันตามข้อมูลจริงของรายการที่ต้องการรับชำระ ระบบจะดึงเอกสารคงค้างของสมาชิกที่เลือกมาแสดงในตาราง.</w:t>
-      </w:r>
-    </w:p>
-    <w:p>
-      <w:r>
-        <w:rPr>
-          <w:rFonts w:ascii="TH Sarabun New" w:hAnsi="TH Sarabun New" w:eastAsia="TH Sarabun New"/>
-          <w:sz w:val="32"/>
-        </w:rPr>
-        <w:t>3. ถ้าต้องการกรองข้อมูลเพิ่มเติม ให้ระบุช่วงวันที่หรือยอดขั้นต่ำ แล้วกดปุ่ม ค้นหาเอกสาร ระบบจะเติมรายการคงค้างลงในตาราง เอกสารที่พบ.</w:t>
-      </w:r>
-    </w:p>
-    <w:p>
-      <w:r>
-        <w:rPr>
-          <w:rFonts w:ascii="TH Sarabun New" w:hAnsi="TH Sarabun New" w:eastAsia="TH Sarabun New"/>
-          <w:sz w:val="32"/>
-        </w:rPr>
-        <w:t>4. ตรวจสอบคอลัมน์ยอดรวม ยอดค้าง และยอดที่จะรับชำระ หากต้องการรับบางรายการให้ติ๊ก is_selected เฉพาะบรรทัดที่ต้องการ.</w:t>
-      </w:r>
-    </w:p>
-    <w:p>
-      <w:r>
-        <w:rPr>
-          <w:rFonts w:ascii="TH Sarabun New" w:hAnsi="TH Sarabun New" w:eastAsia="TH Sarabun New"/>
-          <w:b/>
-          <w:sz w:val="32"/>
-        </w:rPr>
-        <w:t>ขั้นตอนการสร้างรายการรับชำระจริง</w:t>
-      </w:r>
-    </w:p>
-    <w:p>
-      <w:r>
-        <w:rPr>
-          <w:rFonts w:ascii="TH Sarabun New" w:hAnsi="TH Sarabun New" w:eastAsia="TH Sarabun New"/>
-          <w:sz w:val="32"/>
-        </w:rPr>
-        <w:t>1. เมื่อเลือกเอกสารครบแล้ว ให้กดปุ่ม ดำเนินการรับชำระ ระบบจะเปิดหน้าต่าง Payment Register ของ Odoo.</w:t>
-      </w:r>
-    </w:p>
-    <w:p>
-      <w:r>
-        <w:t>2. ใน หน้าต่าง ให้เลือก Journal ที่ต้องการรับเงินจริง เช่น Journal รับเงินสดหรือบัญชีพักรับชำระตามนโยบายของบริษัท.</w:t>
-      </w:r>
-    </w:p>
-    <w:p>
-      <w:r>
-        <w:rPr>
-          <w:rFonts w:ascii="TH Sarabun New" w:hAnsi="TH Sarabun New" w:eastAsia="TH Sarabun New"/>
-          <w:sz w:val="32"/>
-        </w:rPr>
-        <w:t>3. ตรวจสอบ Payment Method และ Payment Date ให้ถูกต้อง จากนั้นกด Create Payment เพื่อสร้างรายการรับเงินจริง.</w:t>
-      </w:r>
-    </w:p>
-    <w:p>
-      <w:r>
-        <w:rPr>
-          <w:rFonts w:ascii="TH Sarabun New" w:hAnsi="TH Sarabun New" w:eastAsia="TH Sarabun New"/>
-          <w:sz w:val="32"/>
-        </w:rPr>
-        <w:t>4. เมื่อระบบสร้าง payment สำเร็จ เอกสาร Group Payment จะเปลี่ยนเป็นสถานะ Done และปุ่ม พิมพ์ใบสำคัญ/ดูรายการชำระเงิน จะใช้งานได้.</w:t>
-      </w:r>
-    </w:p>
-    <w:p>
-      <w:r>
-        <w:t>ตัวอย่างข้อมูลจริงที่ใช้ในคู่มือ</w:t>
-      </w:r>
-    </w:p>
-    <w:tbl>
-      <w:tblPr>
-        <w:tblStyle w:val="TableGrid"/>
-        <w:tblW w:type="auto" w:w="0"/>
-        <w:tblLook w:firstColumn="1" w:firstRow="1" w:lastColumn="0" w:lastRow="0" w:noHBand="0" w:noVBand="1" w:val="04A0"/>
-      </w:tblPr>
-      <w:tblGrid>
-        <w:gridCol w:w="3312"/>
-        <w:gridCol w:w="3312"/>
-        <w:gridCol w:w="3312"/>
-      </w:tblGrid>
-      <w:tr>
-        <w:tc>
-          <w:tcPr>
-            <w:tcW w:type="dxa" w:w="3312"/>
-            <w:shd w:fill="D9EAF7"/>
-          </w:tcPr>
-          <w:p>
-            <w:r>
-              <w:rPr>
-                <w:rFonts w:ascii="TH Sarabun New" w:hAnsi="TH Sarabun New" w:eastAsia="TH Sarabun New"/>
-                <w:sz w:val="28"/>
-              </w:rPr>
-              <w:t>Scenario</w:t>
-            </w:r>
-          </w:p>
-        </w:tc>
-        <w:tc>
-          <w:tcPr>
-            <w:tcW w:type="dxa" w:w="3312"/>
-            <w:shd w:fill="D9EAF7"/>
-          </w:tcPr>
-          <w:p>
-            <w:r>
-              <w:rPr>
-                <w:rFonts w:ascii="TH Sarabun New" w:hAnsi="TH Sarabun New" w:eastAsia="TH Sarabun New"/>
-                <w:sz w:val="28"/>
-              </w:rPr>
-              <w:t>ข้อมูลตัวอย่าง</w:t>
-            </w:r>
-          </w:p>
-        </w:tc>
-        <w:tc>
-          <w:tcPr>
-            <w:tcW w:type="dxa" w:w="3312"/>
-            <w:shd w:fill="D9EAF7"/>
-          </w:tcPr>
-          <w:p>
-            <w:r>
-              <w:rPr>
-                <w:rFonts w:ascii="TH Sarabun New" w:hAnsi="TH Sarabun New" w:eastAsia="TH Sarabun New"/>
-                <w:sz w:val="28"/>
-              </w:rPr>
-              <w:t>ผลลัพธ์ที่ต้องเห็น</w:t>
-            </w:r>
-          </w:p>
-        </w:tc>
-      </w:tr>
-      <w:tr>
-        <w:tc>
-          <w:tcPr>
-            <w:tcW w:type="dxa" w:w="3312"/>
-          </w:tcPr>
-          <w:p>
-            <w:r>
-              <w:rPr>
-                <w:rFonts w:ascii="TH Sarabun New" w:hAnsi="TH Sarabun New" w:eastAsia="TH Sarabun New"/>
-                <w:sz w:val="28"/>
-              </w:rPr>
-              <w:t>Scenario A: ค้นหาเอกสารก่อนรับชำระ</w:t>
-            </w:r>
-          </w:p>
-        </w:tc>
-        <w:tc>
-          <w:tcPr>
-            <w:tcW w:type="dxa" w:w="3312"/>
-          </w:tcPr>
-          <w:p>
-            <w:r>
-              <w:rPr>
-                <w:rFonts w:ascii="TH Sarabun New" w:hAnsi="TH Sarabun New" w:eastAsia="TH Sarabun New"/>
-                <w:sz w:val="28"/>
-              </w:rPr>
-              <w:t>ใช้ record draft ID 157 ซึ่งมีใบ INV-E/26/04/00001 และ INV-E/26/04/00002 ถูกเลือกไว้แล้ว</w:t>
-            </w:r>
-          </w:p>
-        </w:tc>
-        <w:tc>
-          <w:tcPr>
-            <w:tcW w:type="dxa" w:w="3312"/>
-          </w:tcPr>
-          <w:p>
-            <w:r>
-              <w:rPr>
-                <w:rFonts w:ascii="TH Sarabun New" w:hAnsi="TH Sarabun New" w:eastAsia="TH Sarabun New"/>
-                <w:sz w:val="28"/>
-              </w:rPr>
-              <w:t>ผู้ใช้เห็นรายการคงค้าง 2 ใบ และยังสามารถปรับยอดที่จะรับได้</w:t>
-            </w:r>
-          </w:p>
-        </w:tc>
-      </w:tr>
-      <w:tr>
-        <w:tc>
-          <w:tcPr>
-            <w:tcW w:type="dxa" w:w="3312"/>
-          </w:tcPr>
-          <w:p>
-            <w:r>
-              <w:rPr>
-                <w:rFonts w:ascii="TH Sarabun New" w:hAnsi="TH Sarabun New" w:eastAsia="TH Sarabun New"/>
-                <w:sz w:val="28"/>
-              </w:rPr>
-              <w:t>Scenario B: ตรวจสอบรายการหลังสร้าง payment</w:t>
-            </w:r>
-          </w:p>
-        </w:tc>
-        <w:tc>
-          <w:tcPr>
-            <w:tcW w:type="dxa" w:w="3312"/>
-          </w:tcPr>
-          <w:p>
-            <w:r>
-              <w:rPr>
-                <w:rFonts w:ascii="TH Sarabun New" w:hAnsi="TH Sarabun New" w:eastAsia="TH Sarabun New"/>
-                <w:sz w:val="28"/>
-              </w:rPr>
-              <w:t>ใช้ record done ID 142 แล้วกด ดูรายการชำระเงิน</w:t>
-            </w:r>
-          </w:p>
-        </w:tc>
-        <w:tc>
-          <w:tcPr>
-            <w:tcW w:type="dxa" w:w="3312"/>
-          </w:tcPr>
-          <w:p>
-            <w:r>
-              <w:rPr>
-                <w:rFonts w:ascii="TH Sarabun New" w:hAnsi="TH Sarabun New" w:eastAsia="TH Sarabun New"/>
-                <w:sz w:val="28"/>
-              </w:rPr>
-              <w:t>ผู้ใช้สามารถไล่ดู payment ที่ระบบสร้างจาก group payment ได้ทันที</w:t>
-            </w:r>
-          </w:p>
-        </w:tc>
-      </w:tr>
-    </w:tbl>
-    <w:p>
-      <w:r>
-        <w:t>3. ตรวจสอบรายการบัญชี (Journal Entry)</w:t>
-      </w:r>
-    </w:p>
-    <w:p>
-      <w:r>
-        <w:rPr>
-          <w:rFonts w:ascii="TH Sarabun New" w:hAnsi="TH Sarabun New" w:eastAsia="TH Sarabun New"/>
-          <w:b/>
-          <w:sz w:val="32"/>
-        </w:rPr>
-        <w:t>ตัวอย่าง Journal Items จาก payment ที่สร้างโดย Group Payment</w:t>
-      </w:r>
-    </w:p>
-    <w:tbl>
-      <w:tblPr>
-        <w:tblStyle w:val="TableGrid"/>
-        <w:tblW w:type="auto" w:w="0"/>
-        <w:tblLook w:firstColumn="1" w:firstRow="1" w:lastColumn="0" w:lastRow="0" w:noHBand="0" w:noVBand="1" w:val="04A0"/>
-      </w:tblPr>
-      <w:tblGrid>
-        <w:gridCol w:w="2484"/>
-        <w:gridCol w:w="2484"/>
-        <w:gridCol w:w="2484"/>
-        <w:gridCol w:w="2484"/>
-      </w:tblGrid>
-      <w:tr>
-        <w:tc>
-          <w:tcPr>
-            <w:tcW w:type="dxa" w:w="2484"/>
-            <w:shd w:fill="D9EAF7"/>
-          </w:tcPr>
-          <w:p>
-            <w:r>
-              <w:rPr>
-                <w:rFonts w:ascii="TH Sarabun New" w:hAnsi="TH Sarabun New" w:eastAsia="TH Sarabun New"/>
-                <w:sz w:val="28"/>
-              </w:rPr>
-              <w:t>บัญชี</w:t>
-            </w:r>
-          </w:p>
-        </w:tc>
-        <w:tc>
-          <w:tcPr>
-            <w:tcW w:type="dxa" w:w="2484"/>
-            <w:shd w:fill="D9EAF7"/>
-          </w:tcPr>
-          <w:p>
-            <w:r>
-              <w:rPr>
-                <w:rFonts w:ascii="TH Sarabun New" w:hAnsi="TH Sarabun New" w:eastAsia="TH Sarabun New"/>
-                <w:sz w:val="28"/>
-              </w:rPr>
-              <w:t>คำอธิบาย</w:t>
-            </w:r>
-          </w:p>
-        </w:tc>
-        <w:tc>
-          <w:tcPr>
-            <w:tcW w:type="dxa" w:w="2484"/>
-            <w:shd w:fill="D9EAF7"/>
-          </w:tcPr>
-          <w:p>
-            <w:r>
-              <w:rPr>
-                <w:rFonts w:ascii="TH Sarabun New" w:hAnsi="TH Sarabun New" w:eastAsia="TH Sarabun New"/>
-                <w:sz w:val="28"/>
-              </w:rPr>
-              <w:t>Debit</w:t>
-            </w:r>
-          </w:p>
-        </w:tc>
-        <w:tc>
-          <w:tcPr>
-            <w:tcW w:type="dxa" w:w="2484"/>
-            <w:shd w:fill="D9EAF7"/>
-          </w:tcPr>
-          <w:p>
-            <w:r>
-              <w:rPr>
-                <w:rFonts w:ascii="TH Sarabun New" w:hAnsi="TH Sarabun New" w:eastAsia="TH Sarabun New"/>
-                <w:sz w:val="28"/>
-              </w:rPr>
-              <w:t>Credit</w:t>
-            </w:r>
-          </w:p>
-        </w:tc>
-      </w:tr>
-      <w:tr>
-        <w:tc>
-          <w:tcPr>
-            <w:tcW w:type="dxa" w:w="2484"/>
-          </w:tcPr>
-          <w:p>
-            <w:r>
-              <w:rPr>
-                <w:rFonts w:ascii="TH Sarabun New" w:hAnsi="TH Sarabun New" w:eastAsia="TH Sarabun New"/>
-                <w:sz w:val="28"/>
-              </w:rPr>
-              <w:t>111103 บัญชีพักเงินสด</w:t>
-            </w:r>
-          </w:p>
-        </w:tc>
-        <w:tc>
-          <w:tcPr>
-            <w:tcW w:type="dxa" w:w="2484"/>
-          </w:tcPr>
-          <w:p>
-            <w:r>
-              <w:rPr>
-                <w:rFonts w:ascii="TH Sarabun New" w:hAnsi="TH Sarabun New" w:eastAsia="TH Sarabun New"/>
-                <w:sz w:val="28"/>
-              </w:rPr>
-              <w:t>ยอดเงินรับเข้าบัญชีพักก่อนกระทบยอด</w:t>
-            </w:r>
-          </w:p>
-        </w:tc>
-        <w:tc>
-          <w:tcPr>
-            <w:tcW w:type="dxa" w:w="2484"/>
-          </w:tcPr>
-          <w:p>
-            <w:r>
-              <w:rPr>
-                <w:rFonts w:ascii="TH Sarabun New" w:hAnsi="TH Sarabun New" w:eastAsia="TH Sarabun New"/>
-                <w:sz w:val="28"/>
-              </w:rPr>
-              <w:t>26837.5</w:t>
-            </w:r>
-          </w:p>
-        </w:tc>
-        <w:tc>
-          <w:tcPr>
-            <w:tcW w:type="dxa" w:w="2484"/>
-          </w:tcPr>
-          <w:p>
-            <w:r>
-              <w:rPr>
-                <w:rFonts w:ascii="TH Sarabun New" w:hAnsi="TH Sarabun New" w:eastAsia="TH Sarabun New"/>
-                <w:sz w:val="28"/>
-              </w:rPr>
-              <w:t>0.0</w:t>
-            </w:r>
-          </w:p>
-        </w:tc>
-      </w:tr>
-      <w:tr>
-        <w:tc>
-          <w:tcPr>
-            <w:tcW w:type="dxa" w:w="2484"/>
-          </w:tcPr>
-          <w:p>
-            <w:r>
-              <w:rPr>
-                <w:rFonts w:ascii="TH Sarabun New" w:hAnsi="TH Sarabun New" w:eastAsia="TH Sarabun New"/>
-                <w:sz w:val="28"/>
-              </w:rPr>
-              <w:t>113001 ลูกหนี้การค้า - ในประเทศ</w:t>
-            </w:r>
-          </w:p>
-        </w:tc>
-        <w:tc>
-          <w:tcPr>
-            <w:tcW w:type="dxa" w:w="2484"/>
-          </w:tcPr>
-          <w:p>
-            <w:r>
-              <w:rPr>
-                <w:rFonts w:ascii="TH Sarabun New" w:hAnsi="TH Sarabun New" w:eastAsia="TH Sarabun New"/>
-                <w:sz w:val="28"/>
-              </w:rPr>
-              <w:t>ตัดยอดลูกหนี้ของใบแจ้งหนี้ในกลุ่ม</w:t>
-            </w:r>
-          </w:p>
-        </w:tc>
-        <w:tc>
-          <w:tcPr>
-            <w:tcW w:type="dxa" w:w="2484"/>
-          </w:tcPr>
-          <w:p>
-            <w:r>
-              <w:rPr>
-                <w:rFonts w:ascii="TH Sarabun New" w:hAnsi="TH Sarabun New" w:eastAsia="TH Sarabun New"/>
-                <w:sz w:val="28"/>
-              </w:rPr>
-              <w:t>0.0</w:t>
-            </w:r>
-          </w:p>
-        </w:tc>
-        <w:tc>
-          <w:tcPr>
-            <w:tcW w:type="dxa" w:w="2484"/>
-          </w:tcPr>
-          <w:p>
-            <w:r>
-              <w:rPr>
-                <w:rFonts w:ascii="TH Sarabun New" w:hAnsi="TH Sarabun New" w:eastAsia="TH Sarabun New"/>
-                <w:sz w:val="28"/>
-              </w:rPr>
-              <w:t>26837.5</w:t>
-            </w:r>
-          </w:p>
-        </w:tc>
-      </w:tr>
-    </w:tbl>
-    <w:p>
-      <w:r>
-        <w:rPr>
-          <w:b w:val="0"/>
-        </w:rPr>
-        <w:t>หลังบันทึกรายการสำเร็จ ให้เปิด Journal Entry เพื่อตรวจดูว่าระบบบันทึกเงินเข้า เงินออก หรือบัญชีพักไว้ที่บัญชีใดบ้างตามตัวอย่างจริงด้านล่าง.</w:t>
+        <w:t>ภาพขั้นตอนที่ 2 เมนูรับชำระเงินกลุ่มลูกค้า</w:t>
       </w:r>
     </w:p>
     <w:p>
       <w:pPr>
+        <w:spacing w:after="120"/>
+        <w:keepLines/>
+      </w:pPr>
+      <w:r>
+        <w:rPr>
+          <w:rFonts w:ascii="Angsana New" w:hAnsi="Angsana New" w:eastAsia="Angsana New"/>
+          <w:b w:val="0"/>
+          <w:sz w:val="32"/>
+        </w:rPr>
+        <w:t>3. ที่หน้ารายการ ให้เปิดเอกสารที่มีอยู่แล้ว หรือกด New เพื่อสร้างรายการใหม่ จากนั้นตรวจส่วนหัวของเอกสารก่อน ได้แก่ ชื่อกลุ่มลูกค้า วันที่รับชำระ สมุดรายวัน และวิธีรับเงิน</w:t>
+      </w:r>
+    </w:p>
+    <w:p>
+      <w:pPr>
+        <w:spacing w:after="60"/>
         <w:jc w:val="center"/>
+        <w:keepLines/>
       </w:pPr>
       <w:r>
         <w:drawing>
           <wp:inline xmlns:a="http://schemas.openxmlformats.org/drawingml/2006/main" xmlns:pic="http://schemas.openxmlformats.org/drawingml/2006/picture">
-            <wp:extent cx="5852160" cy="4389120"/>
-            <wp:docPr id="9" name="Picture 9"/>
+            <wp:extent cx="5577840" cy="4183380"/>
+            <wp:docPr id="3" name="Picture 3"/>
             <wp:cNvGraphicFramePr>
               <a:graphicFrameLocks noChangeAspect="1"/>
             </wp:cNvGraphicFramePr>
@@ -927,11 +434,11 @@
               <a:graphicData uri="http://schemas.openxmlformats.org/drawingml/2006/picture">
                 <pic:pic>
                   <pic:nvPicPr>
-                    <pic:cNvPr id="0" name="image.png"/>
+                    <pic:cNvPr id="0" name="group_draft_manual_annotated.png"/>
                     <pic:cNvPicPr/>
                   </pic:nvPicPr>
                   <pic:blipFill>
-                    <a:blip r:embed="rId14"/>
+                    <a:blip r:embed="rId11"/>
                     <a:stretch>
                       <a:fillRect/>
                     </a:stretch>
@@ -939,7 +446,7 @@
                   <pic:spPr>
                     <a:xfrm>
                       <a:off x="0" y="0"/>
-                      <a:ext cx="5852160" cy="4389120"/>
+                      <a:ext cx="5577840" cy="4183380"/>
                     </a:xfrm>
                     <a:prstGeom prst="rect"/>
                   </pic:spPr>
@@ -952,25 +459,246 @@
     </w:p>
     <w:p>
       <w:pPr>
+        <w:spacing w:after="160"/>
         <w:jc w:val="center"/>
+        <w:keepLines/>
+        <w:keepLines/>
       </w:pPr>
       <w:r>
-        <w:t>รูป 3.8A.3 Journal Entry ของการรับชำระแบบกลุ่มบริษัทจากข้อมูลจริงในระบบ</w:t>
+        <w:rPr>
+          <w:rFonts w:ascii="Angsana New" w:hAnsi="Angsana New" w:eastAsia="Angsana New"/>
+          <w:b w:val="0"/>
+          <w:sz w:val="32"/>
+        </w:rPr>
+        <w:t>ภาพขั้นตอนที่ 3 หน้าจอเอกสารก่อนเลือกรายการลูกหนี้</w:t>
       </w:r>
     </w:p>
     <w:p>
+      <w:pPr>
+        <w:spacing w:after="120"/>
+        <w:keepLines/>
+      </w:pPr>
       <w:r>
-        <w:t>คำอธิบายช่องสำคัญบนหน้าจอ</w:t>
+        <w:rPr>
+          <w:rFonts w:ascii="Angsana New" w:hAnsi="Angsana New" w:eastAsia="Angsana New"/>
+          <w:b w:val="0"/>
+          <w:sz w:val="32"/>
+        </w:rPr>
+        <w:t>4. เมื่อข้อมูลส่วนหัวครบแล้ว ให้เลือกกลุ่มลูกค้าและสมาชิกในกลุ่มที่ต้องการรับเงิน แล้วกดค้นหาเอกสารค้างชำระ เพื่อให้ระบบดึงใบแจ้งหนี้ที่ยังมียอดค้างของสมาชิกแต่ละรายขึ้นมาให้เลือก</w:t>
       </w:r>
     </w:p>
     <w:p>
+      <w:pPr>
+        <w:spacing w:after="60"/>
+        <w:jc w:val="center"/>
+        <w:keepLines/>
+      </w:pPr>
+      <w:r>
+        <w:drawing>
+          <wp:inline xmlns:a="http://schemas.openxmlformats.org/drawingml/2006/main" xmlns:pic="http://schemas.openxmlformats.org/drawingml/2006/picture">
+            <wp:extent cx="5577840" cy="4183380"/>
+            <wp:docPr id="4" name="Picture 4"/>
+            <wp:cNvGraphicFramePr>
+              <a:graphicFrameLocks noChangeAspect="1"/>
+            </wp:cNvGraphicFramePr>
+            <a:graphic>
+              <a:graphicData uri="http://schemas.openxmlformats.org/drawingml/2006/picture">
+                <pic:pic>
+                  <pic:nvPicPr>
+                    <pic:cNvPr id="0" name="group_payment_wizard_manual_annotated.png"/>
+                    <pic:cNvPicPr/>
+                  </pic:nvPicPr>
+                  <pic:blipFill>
+                    <a:blip r:embed="rId12"/>
+                    <a:stretch>
+                      <a:fillRect/>
+                    </a:stretch>
+                  </pic:blipFill>
+                  <pic:spPr>
+                    <a:xfrm>
+                      <a:off x="0" y="0"/>
+                      <a:ext cx="5577840" cy="4183380"/>
+                    </a:xfrm>
+                    <a:prstGeom prst="rect"/>
+                  </pic:spPr>
+                </pic:pic>
+              </a:graphicData>
+            </a:graphic>
+          </wp:inline>
+        </w:drawing>
+      </w:r>
+    </w:p>
+    <w:p>
+      <w:pPr>
+        <w:spacing w:after="160"/>
+        <w:jc w:val="center"/>
+        <w:keepLines/>
+        <w:keepLines/>
+      </w:pPr>
       <w:r>
         <w:rPr>
-          <w:rFonts w:ascii="TH Sarabun New" w:hAnsi="TH Sarabun New" w:eastAsia="TH Sarabun New"/>
-          <w:b/>
+          <w:rFonts w:ascii="Angsana New" w:hAnsi="Angsana New" w:eastAsia="Angsana New"/>
+          <w:b w:val="0"/>
           <w:sz w:val="32"/>
         </w:rPr>
-        <w:t>ตารางอธิบายฟิลด์สำคัญของหน้าจอ Group Payment</w:t>
+        <w:t>ภาพขั้นตอนที่ 4 หน้าจอค้นหาและเลือกใบแจ้งหนี้ค้างชำระ</w:t>
+      </w:r>
+    </w:p>
+    <w:p>
+      <w:pPr>
+        <w:spacing w:after="120"/>
+        <w:keepLines/>
+      </w:pPr>
+      <w:r>
+        <w:rPr>
+          <w:rFonts w:ascii="Angsana New" w:hAnsi="Angsana New" w:eastAsia="Angsana New"/>
+          <w:b w:val="0"/>
+          <w:sz w:val="32"/>
+        </w:rPr>
+        <w:t>5. ตรวจแต่ละบรรทัดที่ระบบดึงขึ้นมา โดยดูชื่อสมาชิก เลขใบแจ้งหนี้ ยอดค้าง และยอดที่จะรับจริง เลือกเฉพาะบรรทัดที่อยู่ในหลักฐานการรับเงินจริง เพื่อป้องกันการตัดยอดผิดใบหรือเกินยอด</w:t>
+      </w:r>
+    </w:p>
+    <w:p>
+      <w:pPr>
+        <w:spacing w:after="60"/>
+        <w:jc w:val="center"/>
+        <w:keepLines/>
+      </w:pPr>
+      <w:r>
+        <w:drawing>
+          <wp:inline xmlns:a="http://schemas.openxmlformats.org/drawingml/2006/main" xmlns:pic="http://schemas.openxmlformats.org/drawingml/2006/picture">
+            <wp:extent cx="5577840" cy="4183380"/>
+            <wp:docPr id="5" name="Picture 5"/>
+            <wp:cNvGraphicFramePr>
+              <a:graphicFrameLocks noChangeAspect="1"/>
+            </wp:cNvGraphicFramePr>
+            <a:graphic>
+              <a:graphicData uri="http://schemas.openxmlformats.org/drawingml/2006/picture">
+                <pic:pic>
+                  <pic:nvPicPr>
+                    <pic:cNvPr id="0" name="group_payment_wizard_manual_annotated.png"/>
+                    <pic:cNvPicPr/>
+                  </pic:nvPicPr>
+                  <pic:blipFill>
+                    <a:blip r:embed="rId12"/>
+                    <a:stretch>
+                      <a:fillRect/>
+                    </a:stretch>
+                  </pic:blipFill>
+                  <pic:spPr>
+                    <a:xfrm>
+                      <a:off x="0" y="0"/>
+                      <a:ext cx="5577840" cy="4183380"/>
+                    </a:xfrm>
+                    <a:prstGeom prst="rect"/>
+                  </pic:spPr>
+                </pic:pic>
+              </a:graphicData>
+            </a:graphic>
+          </wp:inline>
+        </w:drawing>
+      </w:r>
+    </w:p>
+    <w:p>
+      <w:pPr>
+        <w:spacing w:after="160"/>
+        <w:jc w:val="center"/>
+        <w:keepLines/>
+        <w:keepLines/>
+      </w:pPr>
+      <w:r>
+        <w:rPr>
+          <w:rFonts w:ascii="Angsana New" w:hAnsi="Angsana New" w:eastAsia="Angsana New"/>
+          <w:b w:val="0"/>
+          <w:sz w:val="32"/>
+        </w:rPr>
+        <w:t>ภาพขั้นตอนที่ 5 การตรวจสอบบรรทัดใบแจ้งหนี้ก่อนบันทึกรับเงิน</w:t>
+      </w:r>
+    </w:p>
+    <w:p>
+      <w:pPr>
+        <w:spacing w:after="120"/>
+        <w:keepLines/>
+      </w:pPr>
+      <w:r>
+        <w:rPr>
+          <w:rFonts w:ascii="Angsana New" w:hAnsi="Angsana New" w:eastAsia="Angsana New"/>
+          <w:b w:val="0"/>
+          <w:sz w:val="32"/>
+        </w:rPr>
+        <w:t>6. เมื่อตรวจครบแล้ว ให้บันทึกหรือยืนยันรายการรับชำระ จากนั้นกลับมาตรวจสถานะของเอกสารอีกครั้ง รวมถึงเปิดรายการบัญชีของเอกสารเพื่อดูว่าระบบตัดลูกหนี้และบันทึกเงินรับถูกต้องแล้ว</w:t>
+      </w:r>
+    </w:p>
+    <w:p>
+      <w:pPr>
+        <w:spacing w:after="60"/>
+        <w:jc w:val="center"/>
+        <w:keepLines/>
+      </w:pPr>
+      <w:r>
+        <w:drawing>
+          <wp:inline xmlns:a="http://schemas.openxmlformats.org/drawingml/2006/main" xmlns:pic="http://schemas.openxmlformats.org/drawingml/2006/picture">
+            <wp:extent cx="5577840" cy="4183380"/>
+            <wp:docPr id="6" name="Picture 6"/>
+            <wp:cNvGraphicFramePr>
+              <a:graphicFrameLocks noChangeAspect="1"/>
+            </wp:cNvGraphicFramePr>
+            <a:graphic>
+              <a:graphicData uri="http://schemas.openxmlformats.org/drawingml/2006/picture">
+                <pic:pic>
+                  <pic:nvPicPr>
+                    <pic:cNvPr id="0" name="group_done_manual_annotated.png"/>
+                    <pic:cNvPicPr/>
+                  </pic:nvPicPr>
+                  <pic:blipFill>
+                    <a:blip r:embed="rId13"/>
+                    <a:stretch>
+                      <a:fillRect/>
+                    </a:stretch>
+                  </pic:blipFill>
+                  <pic:spPr>
+                    <a:xfrm>
+                      <a:off x="0" y="0"/>
+                      <a:ext cx="5577840" cy="4183380"/>
+                    </a:xfrm>
+                    <a:prstGeom prst="rect"/>
+                  </pic:spPr>
+                </pic:pic>
+              </a:graphicData>
+            </a:graphic>
+          </wp:inline>
+        </w:drawing>
+      </w:r>
+    </w:p>
+    <w:p>
+      <w:pPr>
+        <w:spacing w:after="160"/>
+        <w:jc w:val="center"/>
+        <w:keepLines/>
+        <w:keepLines/>
+      </w:pPr>
+      <w:r>
+        <w:rPr>
+          <w:rFonts w:ascii="Angsana New" w:hAnsi="Angsana New" w:eastAsia="Angsana New"/>
+          <w:b w:val="0"/>
+          <w:sz w:val="32"/>
+        </w:rPr>
+        <w:t>ภาพขั้นตอนที่ 6 เอกสารหลังบันทึกรับชำระสำเร็จ</w:t>
+      </w:r>
+    </w:p>
+    <w:p>
+      <w:pPr>
+        <w:spacing w:after="80"/>
+        <w:keepLines/>
+        <w:keepNext/>
+      </w:pPr>
+      <w:r>
+        <w:rPr>
+          <w:rFonts w:ascii="Angsana New" w:hAnsi="Angsana New" w:eastAsia="Angsana New"/>
+          <w:b/>
+          <w:sz w:val="36"/>
+        </w:rPr>
+        <w:t>ช่องสำคัญที่ควรตรวจบนหน้าจอ</w:t>
       </w:r>
     </w:p>
     <w:tbl>
@@ -980,53 +708,45 @@
         <w:tblLook w:firstColumn="1" w:firstRow="1" w:lastColumn="0" w:lastRow="0" w:noHBand="0" w:noVBand="1" w:val="04A0"/>
       </w:tblPr>
       <w:tblGrid>
-        <w:gridCol w:w="3312"/>
-        <w:gridCol w:w="3312"/>
-        <w:gridCol w:w="3312"/>
+        <w:gridCol w:w="5112"/>
+        <w:gridCol w:w="5112"/>
       </w:tblGrid>
       <w:tr>
         <w:tc>
           <w:tcPr>
-            <w:tcW w:type="dxa" w:w="3312"/>
-            <w:shd w:fill="D9EAF7"/>
+            <w:tcW w:type="dxa" w:w="5112"/>
+            <w:vAlign w:val="center"/>
           </w:tcPr>
           <w:p>
+            <w:pPr>
+              <w:spacing w:after="40"/>
+            </w:pPr>
             <w:r>
               <w:rPr>
-                <w:rFonts w:ascii="TH Sarabun New" w:hAnsi="TH Sarabun New" w:eastAsia="TH Sarabun New"/>
-                <w:sz w:val="28"/>
+                <w:rFonts w:ascii="Angsana New" w:hAnsi="Angsana New" w:eastAsia="Angsana New"/>
+                <w:b w:val="0"/>
+                <w:sz w:val="32"/>
               </w:rPr>
-              <w:t>Field / Section</w:t>
+              <w:t>Field Name</w:t>
             </w:r>
           </w:p>
         </w:tc>
         <w:tc>
           <w:tcPr>
-            <w:tcW w:type="dxa" w:w="3312"/>
-            <w:shd w:fill="D9EAF7"/>
+            <w:tcW w:type="dxa" w:w="5112"/>
+            <w:vAlign w:val="center"/>
           </w:tcPr>
           <w:p>
+            <w:pPr>
+              <w:spacing w:after="40"/>
+            </w:pPr>
             <w:r>
               <w:rPr>
-                <w:rFonts w:ascii="TH Sarabun New" w:hAnsi="TH Sarabun New" w:eastAsia="TH Sarabun New"/>
-                <w:sz w:val="28"/>
+                <w:rFonts w:ascii="Angsana New" w:hAnsi="Angsana New" w:eastAsia="Angsana New"/>
+                <w:b w:val="0"/>
+                <w:sz w:val="32"/>
               </w:rPr>
-              <w:t>ความหมาย</w:t>
-            </w:r>
-          </w:p>
-        </w:tc>
-        <w:tc>
-          <w:tcPr>
-            <w:tcW w:type="dxa" w:w="3312"/>
-            <w:shd w:fill="D9EAF7"/>
-          </w:tcPr>
-          <w:p>
-            <w:r>
-              <w:rPr>
-                <w:rFonts w:ascii="TH Sarabun New" w:hAnsi="TH Sarabun New" w:eastAsia="TH Sarabun New"/>
-                <w:sz w:val="28"/>
-              </w:rPr>
-              <w:t>วิธีใช้หรือค่าตัวอย่าง</w:t>
+              <w:t>Meaning</w:t>
             </w:r>
           </w:p>
         </w:tc>
@@ -1034,43 +754,39 @@
       <w:tr>
         <w:tc>
           <w:tcPr>
-            <w:tcW w:type="dxa" w:w="3312"/>
+            <w:tcW w:type="dxa" w:w="5112"/>
+            <w:vAlign w:val="center"/>
           </w:tcPr>
           <w:p>
+            <w:pPr>
+              <w:spacing w:after="40"/>
+            </w:pPr>
             <w:r>
               <w:rPr>
-                <w:rFonts w:ascii="TH Sarabun New" w:hAnsi="TH Sarabun New" w:eastAsia="TH Sarabun New"/>
-                <w:sz w:val="28"/>
+                <w:rFonts w:ascii="Angsana New" w:hAnsi="Angsana New" w:eastAsia="Angsana New"/>
+                <w:b w:val="0"/>
+                <w:sz w:val="32"/>
               </w:rPr>
-              <w:t>member_partner_ids</w:t>
+              <w:t>Customer Group</w:t>
             </w:r>
           </w:p>
         </w:tc>
         <w:tc>
           <w:tcPr>
-            <w:tcW w:type="dxa" w:w="3312"/>
+            <w:tcW w:type="dxa" w:w="5112"/>
+            <w:vAlign w:val="center"/>
           </w:tcPr>
           <w:p>
+            <w:pPr>
+              <w:spacing w:after="40"/>
+            </w:pPr>
             <w:r>
               <w:rPr>
-                <w:rFonts w:ascii="TH Sarabun New" w:hAnsi="TH Sarabun New" w:eastAsia="TH Sarabun New"/>
-                <w:sz w:val="28"/>
+                <w:rFonts w:ascii="Angsana New" w:hAnsi="Angsana New" w:eastAsia="Angsana New"/>
+                <w:b w:val="0"/>
+                <w:sz w:val="32"/>
               </w:rPr>
-              <w:t>รายชื่อคู่ค้าภายใต้กลุ่มบริษัทที่ต้องการดึงเอกสารคงค้าง</w:t>
-            </w:r>
-          </w:p>
-        </w:tc>
-        <w:tc>
-          <w:tcPr>
-            <w:tcW w:type="dxa" w:w="3312"/>
-          </w:tcPr>
-          <w:p>
-            <w:r>
-              <w:rPr>
-                <w:rFonts w:ascii="TH Sarabun New" w:hAnsi="TH Sarabun New" w:eastAsia="TH Sarabun New"/>
-                <w:sz w:val="28"/>
-              </w:rPr>
-              <w:t>เลือกคู่ค้าที่อยู่ในกลุ่มเดียวกันเท่านั้น</w:t>
+              <w:t>ชื่อกลุ่มลูกค้าที่ใช้รวมเอกสารเพื่อรับชำระครั้งเดียว</w:t>
             </w:r>
           </w:p>
         </w:tc>
@@ -1078,43 +794,39 @@
       <w:tr>
         <w:tc>
           <w:tcPr>
-            <w:tcW w:type="dxa" w:w="3312"/>
+            <w:tcW w:type="dxa" w:w="5112"/>
+            <w:vAlign w:val="center"/>
           </w:tcPr>
           <w:p>
+            <w:pPr>
+              <w:spacing w:after="40"/>
+            </w:pPr>
             <w:r>
               <w:rPr>
-                <w:rFonts w:ascii="TH Sarabun New" w:hAnsi="TH Sarabun New" w:eastAsia="TH Sarabun New"/>
-                <w:sz w:val="28"/>
+                <w:rFonts w:ascii="Angsana New" w:hAnsi="Angsana New" w:eastAsia="Angsana New"/>
+                <w:b w:val="0"/>
+                <w:sz w:val="32"/>
               </w:rPr>
-              <w:t>summary_info</w:t>
+              <w:t>Members</w:t>
             </w:r>
           </w:p>
         </w:tc>
         <w:tc>
           <w:tcPr>
-            <w:tcW w:type="dxa" w:w="3312"/>
+            <w:tcW w:type="dxa" w:w="5112"/>
+            <w:vAlign w:val="center"/>
           </w:tcPr>
           <w:p>
+            <w:pPr>
+              <w:spacing w:after="40"/>
+            </w:pPr>
             <w:r>
               <w:rPr>
-                <w:rFonts w:ascii="TH Sarabun New" w:hAnsi="TH Sarabun New" w:eastAsia="TH Sarabun New"/>
-                <w:sz w:val="28"/>
+                <w:rFonts w:ascii="Angsana New" w:hAnsi="Angsana New" w:eastAsia="Angsana New"/>
+                <w:b w:val="0"/>
+                <w:sz w:val="32"/>
               </w:rPr>
-              <w:t>สรุปยอดคงค้างรวมของคู่ค้าที่เลือก</w:t>
-            </w:r>
-          </w:p>
-        </w:tc>
-        <w:tc>
-          <w:tcPr>
-            <w:tcW w:type="dxa" w:w="3312"/>
-          </w:tcPr>
-          <w:p>
-            <w:r>
-              <w:rPr>
-                <w:rFonts w:ascii="TH Sarabun New" w:hAnsi="TH Sarabun New" w:eastAsia="TH Sarabun New"/>
-                <w:sz w:val="28"/>
-              </w:rPr>
-              <w:t>ใช้เช็กก่อนเลือกเอกสาร</w:t>
+              <w:t>รายชื่อลูกค้าในกลุ่มที่ระบบจะดึงเอกสารค้างชำระมาให้เลือก</w:t>
             </w:r>
           </w:p>
         </w:tc>
@@ -1122,39 +834,39 @@
       <w:tr>
         <w:tc>
           <w:tcPr>
-            <w:tcW w:type="dxa" w:w="3312"/>
+            <w:tcW w:type="dxa" w:w="5112"/>
+            <w:vAlign w:val="center"/>
           </w:tcPr>
           <w:p>
+            <w:pPr>
+              <w:spacing w:after="40"/>
+            </w:pPr>
             <w:r>
-              <w:t>ตัวกรอง_date_from / ตัวกรอง_date_to</w:t>
+              <w:rPr>
+                <w:rFonts w:ascii="Angsana New" w:hAnsi="Angsana New" w:eastAsia="Angsana New"/>
+                <w:b w:val="0"/>
+                <w:sz w:val="32"/>
+              </w:rPr>
+              <w:t>Journal</w:t>
             </w:r>
           </w:p>
         </w:tc>
         <w:tc>
           <w:tcPr>
-            <w:tcW w:type="dxa" w:w="3312"/>
+            <w:tcW w:type="dxa" w:w="5112"/>
+            <w:vAlign w:val="center"/>
           </w:tcPr>
           <w:p>
+            <w:pPr>
+              <w:spacing w:after="40"/>
+            </w:pPr>
             <w:r>
               <w:rPr>
-                <w:rFonts w:ascii="TH Sarabun New" w:hAnsi="TH Sarabun New" w:eastAsia="TH Sarabun New"/>
-                <w:sz w:val="28"/>
+                <w:rFonts w:ascii="Angsana New" w:hAnsi="Angsana New" w:eastAsia="Angsana New"/>
+                <w:b w:val="0"/>
+                <w:sz w:val="32"/>
               </w:rPr>
-              <w:t>กรองช่วงวันที่เอกสารที่จะดึงเข้ามา</w:t>
-            </w:r>
-          </w:p>
-        </w:tc>
-        <w:tc>
-          <w:tcPr>
-            <w:tcW w:type="dxa" w:w="3312"/>
-          </w:tcPr>
-          <w:p>
-            <w:r>
-              <w:rPr>
-                <w:rFonts w:ascii="TH Sarabun New" w:hAnsi="TH Sarabun New" w:eastAsia="TH Sarabun New"/>
-                <w:sz w:val="28"/>
-              </w:rPr>
-              <w:t>ช่วยตัดรายการเก่าหรืออนาคตออก</w:t>
+              <w:t>ชื่อสมุดรายวันที่ใช้บันทึกรายการบัญชีของการรับเงินครั้งนี้</w:t>
             </w:r>
           </w:p>
         </w:tc>
@@ -1162,39 +874,39 @@
       <w:tr>
         <w:tc>
           <w:tcPr>
-            <w:tcW w:type="dxa" w:w="3312"/>
+            <w:tcW w:type="dxa" w:w="5112"/>
+            <w:vAlign w:val="center"/>
           </w:tcPr>
           <w:p>
+            <w:pPr>
+              <w:spacing w:after="40"/>
+            </w:pPr>
             <w:r>
-              <w:t>ตัวกรอง_min_amount</w:t>
+              <w:rPr>
+                <w:rFonts w:ascii="Angsana New" w:hAnsi="Angsana New" w:eastAsia="Angsana New"/>
+                <w:b w:val="0"/>
+                <w:sz w:val="32"/>
+              </w:rPr>
+              <w:t>Payment Date</w:t>
             </w:r>
           </w:p>
         </w:tc>
         <w:tc>
           <w:tcPr>
-            <w:tcW w:type="dxa" w:w="3312"/>
+            <w:tcW w:type="dxa" w:w="5112"/>
+            <w:vAlign w:val="center"/>
           </w:tcPr>
           <w:p>
+            <w:pPr>
+              <w:spacing w:after="40"/>
+            </w:pPr>
             <w:r>
               <w:rPr>
-                <w:rFonts w:ascii="TH Sarabun New" w:hAnsi="TH Sarabun New" w:eastAsia="TH Sarabun New"/>
-                <w:sz w:val="28"/>
+                <w:rFonts w:ascii="Angsana New" w:hAnsi="Angsana New" w:eastAsia="Angsana New"/>
+                <w:b w:val="0"/>
+                <w:sz w:val="32"/>
               </w:rPr>
-              <w:t>กรองรายการที่ยอดค้างต่ำกว่าเกณฑ์</w:t>
-            </w:r>
-          </w:p>
-        </w:tc>
-        <w:tc>
-          <w:tcPr>
-            <w:tcW w:type="dxa" w:w="3312"/>
-          </w:tcPr>
-          <w:p>
-            <w:r>
-              <w:rPr>
-                <w:rFonts w:ascii="TH Sarabun New" w:hAnsi="TH Sarabun New" w:eastAsia="TH Sarabun New"/>
-                <w:sz w:val="28"/>
-              </w:rPr>
-              <w:t>ช่วยลดรายการย่อยที่ไม่ต้องการรับชำระ</w:t>
+              <w:t>วันที่ที่ระบบจะนำไปใช้เป็นวันที่รับเงินและวันที่ลงบัญชี</w:t>
             </w:r>
           </w:p>
         </w:tc>
@@ -1202,77 +914,513 @@
       <w:tr>
         <w:tc>
           <w:tcPr>
-            <w:tcW w:type="dxa" w:w="3312"/>
+            <w:tcW w:type="dxa" w:w="5112"/>
+            <w:vAlign w:val="center"/>
           </w:tcPr>
           <w:p>
+            <w:pPr>
+              <w:spacing w:after="40"/>
+            </w:pPr>
             <w:r>
               <w:rPr>
-                <w:rFonts w:ascii="TH Sarabun New" w:hAnsi="TH Sarabun New" w:eastAsia="TH Sarabun New"/>
-                <w:sz w:val="28"/>
+                <w:rFonts w:ascii="Angsana New" w:hAnsi="Angsana New" w:eastAsia="Angsana New"/>
+                <w:b w:val="0"/>
+                <w:sz w:val="32"/>
               </w:rPr>
-              <w:t>line_ids</w:t>
+              <w:t>Payment Method</w:t>
             </w:r>
           </w:p>
         </w:tc>
         <w:tc>
           <w:tcPr>
-            <w:tcW w:type="dxa" w:w="3312"/>
+            <w:tcW w:type="dxa" w:w="5112"/>
+            <w:vAlign w:val="center"/>
           </w:tcPr>
           <w:p>
+            <w:pPr>
+              <w:spacing w:after="40"/>
+            </w:pPr>
             <w:r>
               <w:rPr>
-                <w:rFonts w:ascii="TH Sarabun New" w:hAnsi="TH Sarabun New" w:eastAsia="TH Sarabun New"/>
-                <w:sz w:val="28"/>
+                <w:rFonts w:ascii="Angsana New" w:hAnsi="Angsana New" w:eastAsia="Angsana New"/>
+                <w:b w:val="0"/>
+                <w:sz w:val="32"/>
               </w:rPr>
-              <w:t>ตารางเอกสารที่พบ พร้อมยอดรวม ยอดค้าง และยอดที่จะรับชำระ</w:t>
+              <w:t>วิธีรับเงิน เช่น เงินโอน เงินสด หรือวิธีที่กิจการใช้จริง</w:t>
+            </w:r>
+          </w:p>
+        </w:tc>
+      </w:tr>
+      <w:tr>
+        <w:tc>
+          <w:tcPr>
+            <w:tcW w:type="dxa" w:w="5112"/>
+            <w:vAlign w:val="center"/>
+          </w:tcPr>
+          <w:p>
+            <w:pPr>
+              <w:spacing w:after="40"/>
+            </w:pPr>
+            <w:r>
+              <w:rPr>
+                <w:rFonts w:ascii="Angsana New" w:hAnsi="Angsana New" w:eastAsia="Angsana New"/>
+                <w:b w:val="0"/>
+                <w:sz w:val="32"/>
+              </w:rPr>
+              <w:t>Amount</w:t>
             </w:r>
           </w:p>
         </w:tc>
         <w:tc>
           <w:tcPr>
-            <w:tcW w:type="dxa" w:w="3312"/>
+            <w:tcW w:type="dxa" w:w="5112"/>
+            <w:vAlign w:val="center"/>
           </w:tcPr>
           <w:p>
+            <w:pPr>
+              <w:spacing w:after="40"/>
+            </w:pPr>
             <w:r>
               <w:rPr>
-                <w:rFonts w:ascii="TH Sarabun New" w:hAnsi="TH Sarabun New" w:eastAsia="TH Sarabun New"/>
-                <w:sz w:val="28"/>
+                <w:rFonts w:ascii="Angsana New" w:hAnsi="Angsana New" w:eastAsia="Angsana New"/>
+                <w:b w:val="0"/>
+                <w:sz w:val="32"/>
               </w:rPr>
-              <w:t>ช่อง is_selected ใช้เลือกเอกสารที่จะรับจริง</w:t>
+              <w:t>ยอดรวมที่ผู้ใช้งานตั้งใจรับชำระในครั้งนั้น</w:t>
             </w:r>
           </w:p>
         </w:tc>
       </w:tr>
     </w:tbl>
     <w:p>
+      <w:pPr>
+        <w:spacing w:after="80"/>
+        <w:keepLines/>
+        <w:keepNext/>
+      </w:pPr>
       <w:r>
-        <w:t>สิ่งที่ควรตรวจสอบก่อนบันทึก</w:t>
+        <w:rPr>
+          <w:rFonts w:ascii="Angsana New" w:hAnsi="Angsana New" w:eastAsia="Angsana New"/>
+          <w:b/>
+          <w:sz w:val="32"/>
+        </w:rPr>
+        <w:t>4. ตรวจสอบ Journal Entry</w:t>
       </w:r>
     </w:p>
     <w:p>
       <w:pPr>
-        <w:pStyle w:val="ListBullet"/>
+        <w:spacing w:after="80"/>
+        <w:keepLines/>
+        <w:keepNext/>
       </w:pPr>
       <w:r>
         <w:rPr>
-          <w:rFonts w:ascii="TH Sarabun New" w:hAnsi="TH Sarabun New" w:eastAsia="TH Sarabun New"/>
+          <w:rFonts w:ascii="Angsana New" w:hAnsi="Angsana New" w:eastAsia="Angsana New"/>
+          <w:b/>
           <w:sz w:val="32"/>
         </w:rPr>
-        <w:t>ระบบจะใช้ invoice ที่สถานะ Posted และยังมี amount_residual เหลืออยู่เท่านั้น</w:t>
+        <w:t>วิธีอ่าน Journal ในหัวข้อนี้</w:t>
       </w:r>
     </w:p>
     <w:p>
       <w:pPr>
-        <w:pStyle w:val="ListBullet"/>
+        <w:spacing w:after="120"/>
+        <w:keepLines/>
       </w:pPr>
       <w:r>
         <w:rPr>
-          <w:rFonts w:ascii="TH Sarabun New" w:hAnsi="TH Sarabun New" w:eastAsia="TH Sarabun New"/>
+          <w:rFonts w:ascii="Angsana New" w:hAnsi="Angsana New" w:eastAsia="Angsana New"/>
+          <w:b w:val="0"/>
           <w:sz w:val="32"/>
         </w:rPr>
-        <w:t>ถ้าเลือก Journal ผิด รายการเดบิต/เครดิตจะไปลงบัญชีพักคนละชุดทันที จึงควรตรวจสอบใน Payment Register ก่อนกด Create Payment</w:t>
+        <w:t>หลังบันทึกรายการรับชำระแล้ว ให้เปิดรายการบัญชีของเอกสารเดิม ไม่ต้องไปเปิดจากเมนูอื่นก่อน เพราะจะช่วยให้มั่นใจว่า Journal ที่เห็นเป็นของรายการรับเงินครั้งนี้จริง</w:t>
       </w:r>
     </w:p>
+    <w:p>
+      <w:pPr>
+        <w:spacing w:after="120"/>
+        <w:keepLines/>
+      </w:pPr>
+      <w:r>
+        <w:rPr>
+          <w:rFonts w:ascii="Angsana New" w:hAnsi="Angsana New" w:eastAsia="Angsana New"/>
+          <w:b w:val="0"/>
+          <w:sz w:val="32"/>
+        </w:rPr>
+        <w:t>การอ่าน Journal ของหัวข้อนี้ให้ดู 3 เรื่องพร้อมกัน คือ เลขอ้างอิงเอกสาร ชื่อคู่ค้า และยอดรวมที่รับเงิน เพื่อยืนยันว่าระบบตัดยอดลูกหนี้ของสมาชิกในกลุ่มถูกคนและถูกใบ</w:t>
+      </w:r>
+    </w:p>
+    <w:p>
+      <w:pPr>
+        <w:spacing w:after="120"/>
+        <w:keepLines/>
+      </w:pPr>
+      <w:r>
+        <w:rPr>
+          <w:rFonts w:ascii="Angsana New" w:hAnsi="Angsana New" w:eastAsia="Angsana New"/>
+          <w:b w:val="0"/>
+          <w:sz w:val="32"/>
+        </w:rPr>
+        <w:t>จากภาพตัวอย่าง ระบบสร้างรายการบัญชีเลขที่ PCSH3/2026/00843 อ้างอิงใบแจ้งหนี้ INV-D/26/02/01422 วันที่บัญชี 23/02/2026 ยอด 26,837.50 บาท</w:t>
+      </w:r>
+    </w:p>
+    <w:p>
+      <w:pPr>
+        <w:spacing w:after="120"/>
+        <w:keepLines/>
+      </w:pPr>
+      <w:r>
+        <w:rPr>
+          <w:rFonts w:ascii="Angsana New" w:hAnsi="Angsana New" w:eastAsia="Angsana New"/>
+          <w:b w:val="0"/>
+          <w:sz w:val="32"/>
+        </w:rPr>
+        <w:t>บรรทัดด้าน Debit (Dr) คือบัญชี 111103 บัญชีพักเงินสด จำนวน 26,837.50 บาท ความหมายคือระบบรับรู้ว่าเงินเข้ามาแล้ว และพักยอดไว้ในบัญชีรับชำระของกิจการ</w:t>
+      </w:r>
+    </w:p>
+    <w:p>
+      <w:pPr>
+        <w:spacing w:after="120"/>
+        <w:keepLines/>
+      </w:pPr>
+      <w:r>
+        <w:rPr>
+          <w:rFonts w:ascii="Angsana New" w:hAnsi="Angsana New" w:eastAsia="Angsana New"/>
+          <w:b w:val="0"/>
+          <w:sz w:val="32"/>
+        </w:rPr>
+        <w:t>บรรทัดด้าน Credit (Cr) คือบัญชี 113001 ลูกหนี้การค้า - ในประเทศ จำนวน 26,837.50 บาท ความหมายคือระบบตัดยอดหนี้ของลูกค้าที่อยู่ในใบแจ้งหนี้รายการนี้ออกจากบัญชีลูกหนี้</w:t>
+      </w:r>
+    </w:p>
+    <w:p>
+      <w:pPr>
+        <w:spacing w:after="200"/>
+        <w:keepLines/>
+      </w:pPr>
+      <w:r>
+        <w:rPr>
+          <w:rFonts w:ascii="Angsana New" w:hAnsi="Angsana New" w:eastAsia="Angsana New"/>
+          <w:b w:val="0"/>
+          <w:sz w:val="32"/>
+        </w:rPr>
+        <w:t>ถ้ายอด Debit และ Credit เท่ากัน และเลขอ้างอิงตรงกับเอกสารที่ผู้ใช้งานเพิ่งรับชำระ แปลว่าระบบลงบัญชีของการรับเงินครั้งนี้ถูกต้องแล้ว</w:t>
+      </w:r>
+    </w:p>
+    <w:p>
+      <w:pPr>
+        <w:spacing w:after="60"/>
+        <w:jc w:val="center"/>
+        <w:keepLines/>
+      </w:pPr>
+      <w:r>
+        <w:drawing>
+          <wp:inline xmlns:a="http://schemas.openxmlformats.org/drawingml/2006/main" xmlns:pic="http://schemas.openxmlformats.org/drawingml/2006/picture">
+            <wp:extent cx="5577840" cy="4873638"/>
+            <wp:docPr id="7" name="Picture 7"/>
+            <wp:cNvGraphicFramePr>
+              <a:graphicFrameLocks noChangeAspect="1"/>
+            </wp:cNvGraphicFramePr>
+            <a:graphic>
+              <a:graphicData uri="http://schemas.openxmlformats.org/drawingml/2006/picture">
+                <pic:pic>
+                  <pic:nvPicPr>
+                    <pic:cNvPr id="0" name="journal_group_payment_real_annotated.png"/>
+                    <pic:cNvPicPr/>
+                  </pic:nvPicPr>
+                  <pic:blipFill>
+                    <a:blip r:embed="rId14"/>
+                    <a:stretch>
+                      <a:fillRect/>
+                    </a:stretch>
+                  </pic:blipFill>
+                  <pic:spPr>
+                    <a:xfrm>
+                      <a:off x="0" y="0"/>
+                      <a:ext cx="5577840" cy="4873638"/>
+                    </a:xfrm>
+                    <a:prstGeom prst="rect"/>
+                  </pic:spPr>
+                </pic:pic>
+              </a:graphicData>
+            </a:graphic>
+          </wp:inline>
+        </w:drawing>
+      </w:r>
+    </w:p>
+    <w:p>
+      <w:pPr>
+        <w:spacing w:after="160"/>
+        <w:jc w:val="center"/>
+        <w:keepLines/>
+        <w:keepLines/>
+      </w:pPr>
+      <w:r>
+        <w:rPr>
+          <w:rFonts w:ascii="Angsana New" w:hAnsi="Angsana New" w:eastAsia="Angsana New"/>
+          <w:b w:val="0"/>
+          <w:sz w:val="32"/>
+        </w:rPr>
+        <w:t>ภาพ Journal Entry ของการรับชำระแบบกลุ่มบริษัท พร้อมคำอธิบาย Dr/Cr</w:t>
+      </w:r>
+    </w:p>
+    <w:p>
+      <w:pPr>
+        <w:spacing w:after="80"/>
+        <w:keepLines/>
+        <w:keepNext/>
+      </w:pPr>
+      <w:r>
+        <w:rPr>
+          <w:rFonts w:ascii="Angsana New" w:hAnsi="Angsana New" w:eastAsia="Angsana New"/>
+          <w:b/>
+          <w:sz w:val="36"/>
+        </w:rPr>
+        <w:t>แนวคิดการอ่านเดบิตและเครดิตในหัวข้อนี้</w:t>
+      </w:r>
+    </w:p>
+    <w:tbl>
+      <w:tblPr>
+        <w:tblStyle w:val="TableGrid"/>
+        <w:tblW w:type="auto" w:w="0"/>
+        <w:tblLook w:firstColumn="1" w:firstRow="1" w:lastColumn="0" w:lastRow="0" w:noHBand="0" w:noVBand="1" w:val="04A0"/>
+      </w:tblPr>
+      <w:tblGrid>
+        <w:gridCol w:w="3408"/>
+        <w:gridCol w:w="3408"/>
+        <w:gridCol w:w="3408"/>
+      </w:tblGrid>
+      <w:tr>
+        <w:tc>
+          <w:tcPr>
+            <w:tcW w:type="dxa" w:w="3408"/>
+          </w:tcPr>
+          <w:p>
+            <w:pPr>
+              <w:spacing w:after="40"/>
+            </w:pPr>
+            <w:r>
+              <w:rPr>
+                <w:rFonts w:ascii="Angsana New" w:hAnsi="Angsana New" w:eastAsia="Angsana New"/>
+                <w:b w:val="0"/>
+                <w:sz w:val="32"/>
+              </w:rPr>
+              <w:t>บรรทัดที่ต้องดู</w:t>
+            </w:r>
+          </w:p>
+        </w:tc>
+        <w:tc>
+          <w:tcPr>
+            <w:tcW w:type="dxa" w:w="3408"/>
+          </w:tcPr>
+          <w:p>
+            <w:pPr>
+              <w:spacing w:after="40"/>
+            </w:pPr>
+            <w:r>
+              <w:rPr>
+                <w:rFonts w:ascii="Angsana New" w:hAnsi="Angsana New" w:eastAsia="Angsana New"/>
+                <w:b w:val="0"/>
+                <w:sz w:val="32"/>
+              </w:rPr>
+              <w:t>ความหมายแบบเข้าใจง่าย</w:t>
+            </w:r>
+          </w:p>
+        </w:tc>
+        <w:tc>
+          <w:tcPr>
+            <w:tcW w:type="dxa" w:w="3408"/>
+          </w:tcPr>
+          <w:p>
+            <w:pPr>
+              <w:spacing w:after="40"/>
+            </w:pPr>
+            <w:r>
+              <w:rPr>
+                <w:rFonts w:ascii="Angsana New" w:hAnsi="Angsana New" w:eastAsia="Angsana New"/>
+                <w:b w:val="0"/>
+                <w:sz w:val="32"/>
+              </w:rPr>
+              <w:t>สิ่งที่ควรตรวจ</w:t>
+            </w:r>
+          </w:p>
+        </w:tc>
+      </w:tr>
+      <w:tr>
+        <w:tc>
+          <w:tcPr>
+            <w:tcW w:type="dxa" w:w="3408"/>
+          </w:tcPr>
+          <w:p>
+            <w:pPr>
+              <w:spacing w:after="40"/>
+            </w:pPr>
+            <w:r>
+              <w:rPr>
+                <w:rFonts w:ascii="Angsana New" w:hAnsi="Angsana New" w:eastAsia="Angsana New"/>
+                <w:b w:val="0"/>
+                <w:sz w:val="32"/>
+              </w:rPr>
+              <w:t>Debit (Dr) เงินรับหรือบัญชีพักรับชำระ</w:t>
+            </w:r>
+          </w:p>
+        </w:tc>
+        <w:tc>
+          <w:tcPr>
+            <w:tcW w:type="dxa" w:w="3408"/>
+          </w:tcPr>
+          <w:p>
+            <w:pPr>
+              <w:spacing w:after="40"/>
+            </w:pPr>
+            <w:r>
+              <w:rPr>
+                <w:rFonts w:ascii="Angsana New" w:hAnsi="Angsana New" w:eastAsia="Angsana New"/>
+                <w:b w:val="0"/>
+                <w:sz w:val="32"/>
+              </w:rPr>
+              <w:t>เป็นฝั่งที่ระบบบันทึกว่าเงินเข้ามาแล้ว หรือมีรายการรับเงินรอเคลียร์</w:t>
+            </w:r>
+          </w:p>
+        </w:tc>
+        <w:tc>
+          <w:tcPr>
+            <w:tcW w:type="dxa" w:w="3408"/>
+          </w:tcPr>
+          <w:p>
+            <w:pPr>
+              <w:spacing w:after="40"/>
+            </w:pPr>
+            <w:r>
+              <w:rPr>
+                <w:rFonts w:ascii="Angsana New" w:hAnsi="Angsana New" w:eastAsia="Angsana New"/>
+                <w:b w:val="0"/>
+                <w:sz w:val="32"/>
+              </w:rPr>
+              <w:t>ตรวจชื่อบัญชีและยอดว่าเท่ากับยอดที่รับจริง</w:t>
+            </w:r>
+          </w:p>
+        </w:tc>
+      </w:tr>
+      <w:tr>
+        <w:tc>
+          <w:tcPr>
+            <w:tcW w:type="dxa" w:w="3408"/>
+          </w:tcPr>
+          <w:p>
+            <w:pPr>
+              <w:spacing w:after="40"/>
+            </w:pPr>
+            <w:r>
+              <w:rPr>
+                <w:rFonts w:ascii="Angsana New" w:hAnsi="Angsana New" w:eastAsia="Angsana New"/>
+                <w:b w:val="0"/>
+                <w:sz w:val="32"/>
+              </w:rPr>
+              <w:t>Credit (Cr) ลูกหนี้การค้า</w:t>
+            </w:r>
+          </w:p>
+        </w:tc>
+        <w:tc>
+          <w:tcPr>
+            <w:tcW w:type="dxa" w:w="3408"/>
+          </w:tcPr>
+          <w:p>
+            <w:pPr>
+              <w:spacing w:after="40"/>
+            </w:pPr>
+            <w:r>
+              <w:rPr>
+                <w:rFonts w:ascii="Angsana New" w:hAnsi="Angsana New" w:eastAsia="Angsana New"/>
+                <w:b w:val="0"/>
+                <w:sz w:val="32"/>
+              </w:rPr>
+              <w:t>เป็นฝั่งที่ระบบตัดยอดหนี้ของใบแจ้งหนี้ที่ถูกเลือกมารับชำระ</w:t>
+            </w:r>
+          </w:p>
+        </w:tc>
+        <w:tc>
+          <w:tcPr>
+            <w:tcW w:type="dxa" w:w="3408"/>
+          </w:tcPr>
+          <w:p>
+            <w:pPr>
+              <w:spacing w:after="40"/>
+            </w:pPr>
+            <w:r>
+              <w:rPr>
+                <w:rFonts w:ascii="Angsana New" w:hAnsi="Angsana New" w:eastAsia="Angsana New"/>
+                <w:b w:val="0"/>
+                <w:sz w:val="32"/>
+              </w:rPr>
+              <w:t>ตรวจว่าเลขใบแจ้งหนี้และยอดที่ตัดตรงกับเอกสารลูกหนี้จริง</w:t>
+            </w:r>
+          </w:p>
+        </w:tc>
+      </w:tr>
+    </w:tbl>
+    <w:p>
+      <w:pPr>
+        <w:spacing w:after="80"/>
+        <w:keepLines/>
+        <w:keepNext/>
+      </w:pPr>
+      <w:r>
+        <w:rPr>
+          <w:rFonts w:ascii="Angsana New" w:hAnsi="Angsana New" w:eastAsia="Angsana New"/>
+          <w:b/>
+          <w:sz w:val="32"/>
+        </w:rPr>
+        <w:t>ข้อควรระวัง</w:t>
+      </w:r>
+    </w:p>
+    <w:p>
+      <w:pPr>
+        <w:spacing w:after="120"/>
+        <w:keepLines/>
+      </w:pPr>
+      <w:r>
+        <w:rPr>
+          <w:rFonts w:ascii="Angsana New" w:hAnsi="Angsana New" w:eastAsia="Angsana New"/>
+          <w:b w:val="0"/>
+          <w:sz w:val="32"/>
+        </w:rPr>
+        <w:t>อย่าเลือกใบแจ้งหนี้เกินกว่าหลักฐานการรับเงินจริง เพราะระบบจะตัดยอดลูกหนี้ทันทีหลังบันทึกรายการ</w:t>
+      </w:r>
+    </w:p>
+    <w:p>
+      <w:pPr>
+        <w:spacing w:after="120"/>
+        <w:keepLines/>
+      </w:pPr>
+      <w:r>
+        <w:rPr>
+          <w:rFonts w:ascii="Angsana New" w:hAnsi="Angsana New" w:eastAsia="Angsana New"/>
+          <w:b w:val="0"/>
+          <w:sz w:val="32"/>
+        </w:rPr>
+        <w:t>ก่อนยืนยันรายการทุกครั้ง ควรตรวจวันที่รับเงิน ชื่อกลุ่มลูกค้า และยอดรวมให้ตรงกับเอกสารประกอบ</w:t>
+      </w:r>
+    </w:p>
+    <w:p>
+      <w:pPr>
+        <w:spacing w:after="120"/>
+        <w:keepLines/>
+      </w:pPr>
+      <w:r>
+        <w:rPr>
+          <w:rFonts w:ascii="Angsana New" w:hAnsi="Angsana New" w:eastAsia="Angsana New"/>
+          <w:b w:val="0"/>
+          <w:sz w:val="32"/>
+        </w:rPr>
+        <w:t>หลังบันทึกแล้ว ควรเปิด Journal Entry ตรวจซ้ำอย่างน้อยหนึ่งครั้ง เพื่อยืนยันว่าระบบลงบัญชีตรงกับรายการรับเงินจริง</w:t>
+      </w:r>
+    </w:p>
+    <w:sectPr>
+      <w:pgSz w:w="12240" w:h="15840"/>
+      <w:pgMar w:top="864" w:right="1008" w:bottom="864" w:left="1008" w:header="720" w:footer="720" w:gutter="0"/>
+      <w:cols w:space="720"/>
+      <w:docGrid w:linePitch="360"/>
+    </w:sectPr>
   </w:body>
 </w:document>
 </file>
@@ -1640,10 +1788,6 @@
     <w:name w:val="Normal"/>
     <w:qFormat/>
     <w:rsid w:val="00FC693F"/>
-    <w:rPr>
-      <w:rFonts w:ascii="TH Sarabun New" w:hAnsi="TH Sarabun New" w:eastAsia="TH Sarabun New"/>
-      <w:sz w:val="32"/>
-    </w:rPr>
   </w:style>
   <w:style w:type="paragraph" w:styleId="Header">
     <w:name w:val="header"/>

</xml_diff>